<commit_message>
Actualizacion aplicación para generar PQRSDF de convocatoria de pregrado a 2026-2
</commit_message>
<xml_diff>
--- a/Impedido_literal_a.docx
+++ b/Impedido_literal_a.docx
@@ -21,7 +21,7 @@
           <w:rFonts w:ascii="Arial Narrow" w:hAnsi="Arial Narrow" w:cs="Arial"/>
           <w:lang w:eastAsia="es-CO"/>
         </w:rPr>
-        <w:t xml:space="preserve">diciembre </w:t>
+        <w:t xml:space="preserve">junio </w:t>
       </w:r>
       <w:r>
         <w:rPr>
@@ -35,7 +35,7 @@
           <w:rFonts w:ascii="Arial Narrow" w:hAnsi="Arial Narrow" w:cs="Arial"/>
           <w:lang w:eastAsia="es-CO"/>
         </w:rPr>
-        <w:t>5</w:t>
+        <w:t>6</w:t>
       </w:r>
       <w:r>
         <w:rPr>
@@ -143,7 +143,13 @@
         <w:rPr>
           <w:rFonts w:ascii="Arial Narrow" w:hAnsi="Arial Narrow" w:cs="Arial"/>
         </w:rPr>
-        <w:t>6-1</w:t>
+        <w:t>6-</w:t>
+      </w:r>
+      <w:r>
+        <w:rPr>
+          <w:rFonts w:ascii="Arial Narrow" w:hAnsi="Arial Narrow" w:cs="Arial"/>
+        </w:rPr>
+        <w:t>2</w:t>
       </w:r>
     </w:p>
     <w:p>
@@ -212,23 +218,7 @@
           <w:rFonts w:ascii="Arial Narrow" w:hAnsi="Arial Narrow" w:cs="Arial"/>
           <w:bCs/>
         </w:rPr>
-        <w:t>{{Celular}} – {{</w:t>
-      </w:r>
-      <w:proofErr w:type="spellStart"/>
-      <w:r>
-        <w:rPr>
-          <w:rFonts w:ascii="Arial Narrow" w:hAnsi="Arial Narrow" w:cs="Arial"/>
-          <w:bCs/>
-        </w:rPr>
-        <w:t>CelularAlterno</w:t>
-      </w:r>
-      <w:proofErr w:type="spellEnd"/>
-      <w:r>
-        <w:rPr>
-          <w:rFonts w:ascii="Arial Narrow" w:hAnsi="Arial Narrow" w:cs="Arial"/>
-          <w:bCs/>
-        </w:rPr>
-        <w:t>}}</w:t>
+        <w:t>{{Celular}} – {{CelularAlterno}}</w:t>
       </w:r>
     </w:p>
     <w:p>
@@ -280,12 +270,18 @@
         <w:rPr>
           <w:rFonts w:ascii="Arial Narrow" w:eastAsia="Calibri" w:hAnsi="Arial Narrow" w:cs="Arial"/>
         </w:rPr>
-        <w:t>2026-1</w:t>
+        <w:t>2026-</w:t>
       </w:r>
       <w:r>
         <w:rPr>
           <w:rFonts w:ascii="Arial Narrow" w:eastAsia="Calibri" w:hAnsi="Arial Narrow" w:cs="Arial"/>
         </w:rPr>
+        <w:t>2</w:t>
+      </w:r>
+      <w:r>
+        <w:rPr>
+          <w:rFonts w:ascii="Arial Narrow" w:eastAsia="Calibri" w:hAnsi="Arial Narrow" w:cs="Arial"/>
+        </w:rPr>
         <w:t>.</w:t>
       </w:r>
     </w:p>
@@ -323,6 +319,12 @@
           <w:rFonts w:ascii="Arial Narrow" w:eastAsia="Calibri" w:hAnsi="Arial Narrow" w:cs="Arial"/>
         </w:rPr>
         <w:t>o</w:t>
+      </w:r>
+      <w:r>
+        <w:rPr>
+          <w:rFonts w:ascii="Arial Narrow" w:eastAsia="Calibri" w:hAnsi="Arial Narrow" w:cs="Arial"/>
+        </w:rPr>
+        <w:t>(a)</w:t>
       </w:r>
       <w:r>
         <w:rPr>
@@ -376,7 +378,6 @@
         </w:rPr>
         <w:t>, en aras de dar respuesta a la solicitud emitida bajo radicado </w:t>
       </w:r>
-      <w:proofErr w:type="spellStart"/>
       <w:r>
         <w:rPr>
           <w:rFonts w:ascii="Arial Narrow" w:hAnsi="Arial Narrow" w:cs="Arial"/>
@@ -392,7 +393,6 @@
         </w:rPr>
         <w:t>°</w:t>
       </w:r>
-      <w:proofErr w:type="spellEnd"/>
       <w:r>
         <w:rPr>
           <w:rFonts w:ascii="Arial Narrow" w:hAnsi="Arial Narrow" w:cs="Arial"/>
@@ -473,25 +473,30 @@
           <w:color w:val="000000"/>
           <w:lang w:eastAsia="es-CO"/>
         </w:rPr>
-        <w:t xml:space="preserve">Usted se presentó al Programa Único de Acceso y Permanencia – PUAP, en la línea de créditos </w:t>
-      </w:r>
-      <w:proofErr w:type="spellStart"/>
+        <w:t>Usted se presentó al Programa Único de Acceso y Permanencia – PUAP, en la línea de créditos condonables de pregrado en la fuente de financiación de</w:t>
+      </w:r>
       <w:r>
         <w:rPr>
           <w:rFonts w:ascii="Arial Narrow" w:hAnsi="Arial Narrow" w:cs="Arial"/>
           <w:color w:val="000000"/>
           <w:lang w:eastAsia="es-CO"/>
         </w:rPr>
-        <w:t>condonables</w:t>
-      </w:r>
-      <w:proofErr w:type="spellEnd"/>
+        <w:t xml:space="preserve"> </w:t>
+      </w:r>
+      <w:r>
+        <w:rPr>
+          <w:rFonts w:ascii="Arial Narrow" w:hAnsi="Arial Narrow" w:cs="Arial"/>
+          <w:bdr w:val="none" w:sz="0" w:space="0" w:color="auto" w:frame="1"/>
+        </w:rPr>
+        <w:t xml:space="preserve">{{fuente_escogida}} </w:t>
+      </w:r>
       <w:r>
         <w:rPr>
           <w:rFonts w:ascii="Arial Narrow" w:hAnsi="Arial Narrow" w:cs="Arial"/>
           <w:color w:val="000000"/>
           <w:lang w:eastAsia="es-CO"/>
         </w:rPr>
-        <w:t xml:space="preserve"> de pregrado en la fuente de financiación de Presupuesto Participativo para la convocatoria 202</w:t>
+        <w:t>para la convocatoria 202</w:t>
       </w:r>
       <w:r>
         <w:rPr>
@@ -499,7 +504,15 @@
           <w:color w:val="000000"/>
           <w:lang w:eastAsia="es-CO"/>
         </w:rPr>
-        <w:t>6-1</w:t>
+        <w:t>6-</w:t>
+      </w:r>
+      <w:r>
+        <w:rPr>
+          <w:rFonts w:ascii="Arial Narrow" w:hAnsi="Arial Narrow" w:cs="Arial"/>
+          <w:color w:val="000000"/>
+          <w:lang w:eastAsia="es-CO"/>
+        </w:rPr>
+        <w:t>2</w:t>
       </w:r>
       <w:r>
         <w:rPr>
@@ -574,27 +587,7 @@
           <w:u w:val="single"/>
           <w:lang w:eastAsia="es-CO"/>
         </w:rPr>
-        <w:t xml:space="preserve">se </w:t>
-      </w:r>
-      <w:r>
-        <w:rPr>
-          <w:rFonts w:ascii="Arial Narrow" w:hAnsi="Arial Narrow" w:cs="Arial"/>
-          <w:b/>
-          <w:bCs/>
-          <w:u w:val="single"/>
-          <w:lang w:eastAsia="es-CO"/>
-        </w:rPr>
-        <w:t xml:space="preserve">encuentra </w:t>
-      </w:r>
-      <w:r>
-        <w:rPr>
-          <w:rFonts w:ascii="Arial Narrow" w:hAnsi="Arial Narrow" w:cs="Arial"/>
-          <w:b/>
-          <w:bCs/>
-          <w:u w:val="single"/>
-          <w:lang w:eastAsia="es-CO"/>
-        </w:rPr>
-        <w:t xml:space="preserve">con el impedimento contemplado en el literal a) del artículo 71 del Decreto 032 de 2023, modificado por el artículo 36 del Decreto 0344 de 2025, para la fuente de financiación </w:t>
+        <w:t xml:space="preserve">se encuentra con el impedimento contemplado en el literal a) del artículo 71 del Decreto 032 de 2023, modificado por el artículo 36 del Decreto 0344 de 2025, para la fuente de financiación </w:t>
       </w:r>
       <w:r>
         <w:rPr>
@@ -605,7 +598,18 @@
           <w:u w:val="single"/>
           <w:lang w:eastAsia="es-CO"/>
         </w:rPr>
-        <w:t>Presupuesto Participativo</w:t>
+        <w:t xml:space="preserve">de </w:t>
+      </w:r>
+      <w:r>
+        <w:rPr>
+          <w:rFonts w:ascii="Arial Narrow" w:hAnsi="Arial Narrow" w:cs="Arial"/>
+          <w:b/>
+          <w:bCs/>
+          <w:color w:val="000000"/>
+          <w:u w:val="single"/>
+          <w:lang w:eastAsia="es-CO"/>
+        </w:rPr>
+        <w:t>{{fuente_escogida}}</w:t>
       </w:r>
       <w:r>
         <w:rPr>
@@ -776,7 +780,7 @@
           <w:sz w:val="24"/>
           <w:szCs w:val="24"/>
         </w:rPr>
-        <w:t xml:space="preserve">5384 </w:t>
+        <w:t xml:space="preserve">1737 </w:t>
       </w:r>
       <w:r>
         <w:rPr>
@@ -784,28 +788,24 @@
           <w:sz w:val="24"/>
           <w:szCs w:val="24"/>
         </w:rPr>
-        <w:t>de 2025, “</w:t>
-      </w:r>
-      <w:r>
-        <w:rPr>
-          <w:rFonts w:ascii="Arial Narrow" w:hAnsi="Arial Narrow" w:cs="Arial"/>
-          <w:i/>
+        <w:t>de 202</w:t>
+      </w:r>
+      <w:r>
+        <w:rPr>
+          <w:rFonts w:ascii="Arial Narrow" w:hAnsi="Arial Narrow" w:cs="Arial"/>
           <w:sz w:val="24"/>
           <w:szCs w:val="24"/>
         </w:rPr>
-        <w:t xml:space="preserve">Por medio de la cual se realiza la apertura de convocatoria para la línea de crédito </w:t>
-      </w:r>
-      <w:proofErr w:type="spellStart"/>
-      <w:r>
-        <w:rPr>
-          <w:rFonts w:ascii="Arial Narrow" w:hAnsi="Arial Narrow" w:cs="Arial"/>
-          <w:i/>
+        <w:t>6</w:t>
+      </w:r>
+      <w:r>
+        <w:rPr>
+          <w:rFonts w:ascii="Arial Narrow" w:hAnsi="Arial Narrow" w:cs="Arial"/>
           <w:sz w:val="24"/>
           <w:szCs w:val="24"/>
         </w:rPr>
-        <w:t>condonable</w:t>
-      </w:r>
-      <w:proofErr w:type="spellEnd"/>
+        <w:t>, “</w:t>
+      </w:r>
       <w:r>
         <w:rPr>
           <w:rFonts w:ascii="Arial Narrow" w:hAnsi="Arial Narrow" w:cs="Arial"/>
@@ -813,7 +813,7 @@
           <w:sz w:val="24"/>
           <w:szCs w:val="24"/>
         </w:rPr>
-        <w:t xml:space="preserve"> pregrado del Programa Único de Acceso y Permanencia en la educación postsecundaria - PUAP, convocatoria </w:t>
+        <w:t xml:space="preserve">Por medio de la cual se realiza la apertura de convocatoria para la línea de crédito condonable pregrado del Programa Único de Acceso y Permanencia en la educación postsecundaria - PUAP, convocatoria </w:t>
       </w:r>
       <w:r>
         <w:rPr>
@@ -822,7 +822,16 @@
           <w:sz w:val="24"/>
           <w:szCs w:val="24"/>
         </w:rPr>
-        <w:t>2026-1</w:t>
+        <w:t>2026-</w:t>
+      </w:r>
+      <w:r>
+        <w:rPr>
+          <w:rFonts w:ascii="Arial Narrow" w:hAnsi="Arial Narrow" w:cs="Arial"/>
+          <w:i/>
+          <w:sz w:val="24"/>
+          <w:szCs w:val="24"/>
+        </w:rPr>
+        <w:t>2</w:t>
       </w:r>
       <w:r>
         <w:rPr>
@@ -876,7 +885,7 @@
           <w:sz w:val="24"/>
           <w:szCs w:val="24"/>
         </w:rPr>
-        <w:t>6788</w:t>
+        <w:t>3106</w:t>
       </w:r>
       <w:r>
         <w:rPr>
@@ -884,28 +893,24 @@
           <w:sz w:val="24"/>
           <w:szCs w:val="24"/>
         </w:rPr>
-        <w:t xml:space="preserve"> de 2025, “</w:t>
-      </w:r>
-      <w:r>
-        <w:rPr>
-          <w:rFonts w:ascii="Arial Narrow" w:hAnsi="Arial Narrow" w:cs="Arial"/>
-          <w:i/>
+        <w:t xml:space="preserve"> de 202</w:t>
+      </w:r>
+      <w:r>
+        <w:rPr>
+          <w:rFonts w:ascii="Arial Narrow" w:hAnsi="Arial Narrow" w:cs="Arial"/>
           <w:sz w:val="24"/>
           <w:szCs w:val="24"/>
         </w:rPr>
-        <w:t xml:space="preserve">Por medio de la cual se establecen los puntos de corte, para la línea de créditos </w:t>
-      </w:r>
-      <w:proofErr w:type="spellStart"/>
-      <w:r>
-        <w:rPr>
-          <w:rFonts w:ascii="Arial Narrow" w:hAnsi="Arial Narrow" w:cs="Arial"/>
-          <w:i/>
+        <w:t>6</w:t>
+      </w:r>
+      <w:r>
+        <w:rPr>
+          <w:rFonts w:ascii="Arial Narrow" w:hAnsi="Arial Narrow" w:cs="Arial"/>
           <w:sz w:val="24"/>
           <w:szCs w:val="24"/>
         </w:rPr>
-        <w:t>condonables</w:t>
-      </w:r>
-      <w:proofErr w:type="spellEnd"/>
+        <w:t>, “</w:t>
+      </w:r>
       <w:r>
         <w:rPr>
           <w:rFonts w:ascii="Arial Narrow" w:hAnsi="Arial Narrow" w:cs="Arial"/>
@@ -913,7 +918,7 @@
           <w:sz w:val="24"/>
           <w:szCs w:val="24"/>
         </w:rPr>
-        <w:t xml:space="preserve"> pregrado del Programa Único de Acceso y Permanencia en la educación postsecundaria - PUAP, convocatoria </w:t>
+        <w:t xml:space="preserve">Por medio de la cual se establecen los puntos de corte, para la línea de créditos condonables pregrado del Programa Único de Acceso y Permanencia en la educación postsecundaria - PUAP, convocatoria </w:t>
       </w:r>
       <w:r>
         <w:rPr>
@@ -922,7 +927,16 @@
           <w:sz w:val="24"/>
           <w:szCs w:val="24"/>
         </w:rPr>
-        <w:t>2026-1</w:t>
+        <w:t>2026-</w:t>
+      </w:r>
+      <w:r>
+        <w:rPr>
+          <w:rFonts w:ascii="Arial Narrow" w:hAnsi="Arial Narrow" w:cs="Arial"/>
+          <w:i/>
+          <w:sz w:val="24"/>
+          <w:szCs w:val="24"/>
+        </w:rPr>
+        <w:t>2</w:t>
       </w:r>
       <w:r>
         <w:rPr>
@@ -1118,7 +1132,6 @@
         </w:rPr>
         <w:t xml:space="preserve"> </w:t>
       </w:r>
-      <w:proofErr w:type="spellStart"/>
       <w:r>
         <w:rPr>
           <w:rFonts w:ascii="Arial Narrow" w:hAnsi="Arial Narrow"/>
@@ -1141,16 +1154,15 @@
           <w:i/>
           <w:iCs/>
         </w:rPr>
-        <w:t>nables</w:t>
-      </w:r>
-      <w:proofErr w:type="spellEnd"/>
+        <w:t xml:space="preserve">nables, Capítulo </w:t>
+      </w:r>
       <w:r>
         <w:rPr>
           <w:rFonts w:ascii="Arial Narrow" w:hAnsi="Arial Narrow"/>
           <w:i/>
           <w:iCs/>
         </w:rPr>
-        <w:t xml:space="preserve">, Capítulo </w:t>
+        <w:t>I</w:t>
       </w:r>
       <w:r>
         <w:rPr>
@@ -1158,7 +1170,7 @@
           <w:i/>
           <w:iCs/>
         </w:rPr>
-        <w:t>I</w:t>
+        <w:t>: Créditos Cond</w:t>
       </w:r>
       <w:r>
         <w:rPr>
@@ -1166,41 +1178,15 @@
           <w:i/>
           <w:iCs/>
         </w:rPr>
-        <w:t xml:space="preserve">: Créditos </w:t>
-      </w:r>
-      <w:proofErr w:type="spellStart"/>
+        <w:t>o</w:t>
+      </w:r>
       <w:r>
         <w:rPr>
           <w:rFonts w:ascii="Arial Narrow" w:hAnsi="Arial Narrow"/>
           <w:i/>
           <w:iCs/>
         </w:rPr>
-        <w:t>Cond</w:t>
-      </w:r>
-      <w:r>
-        <w:rPr>
-          <w:rFonts w:ascii="Arial Narrow" w:hAnsi="Arial Narrow"/>
-          <w:i/>
-          <w:iCs/>
-        </w:rPr>
-        <w:t>o</w:t>
-      </w:r>
-      <w:r>
-        <w:rPr>
-          <w:rFonts w:ascii="Arial Narrow" w:hAnsi="Arial Narrow"/>
-          <w:i/>
-          <w:iCs/>
-        </w:rPr>
-        <w:t>nables</w:t>
-      </w:r>
-      <w:proofErr w:type="spellEnd"/>
-      <w:r>
-        <w:rPr>
-          <w:rFonts w:ascii="Arial Narrow" w:hAnsi="Arial Narrow"/>
-          <w:i/>
-          <w:iCs/>
-        </w:rPr>
-        <w:t xml:space="preserve"> del Decreto 032 de 2023, el cual</w:t>
+        <w:t>nables del Decreto 032 de 2023, el cual</w:t>
       </w:r>
       <w:r>
         <w:rPr>
@@ -1264,16 +1250,15 @@
           <w:i/>
           <w:iCs/>
         </w:rPr>
-        <w:t xml:space="preserve">de Matrícula Cero, que aspiren a la Línea de crédito </w:t>
-      </w:r>
-      <w:proofErr w:type="spellStart"/>
+        <w:t>de Matrícula Cero, que aspiren a la Línea de crédito cond</w:t>
+      </w:r>
       <w:r>
         <w:rPr>
           <w:rFonts w:ascii="Arial Narrow" w:hAnsi="Arial Narrow"/>
           <w:i/>
           <w:iCs/>
         </w:rPr>
-        <w:t>cond</w:t>
+        <w:t>o</w:t>
       </w:r>
       <w:r>
         <w:rPr>
@@ -1281,24 +1266,7 @@
           <w:i/>
           <w:iCs/>
         </w:rPr>
-        <w:t>o</w:t>
-      </w:r>
-      <w:r>
-        <w:rPr>
-          <w:rFonts w:ascii="Arial Narrow" w:hAnsi="Arial Narrow"/>
-          <w:i/>
-          <w:iCs/>
-        </w:rPr>
-        <w:t>nable</w:t>
-      </w:r>
-      <w:proofErr w:type="spellEnd"/>
-      <w:r>
-        <w:rPr>
-          <w:rFonts w:ascii="Arial Narrow" w:hAnsi="Arial Narrow"/>
-          <w:i/>
-          <w:iCs/>
-        </w:rPr>
-        <w:t xml:space="preserve"> en la</w:t>
+        <w:t>nable en la</w:t>
       </w:r>
       <w:r>
         <w:rPr>
@@ -1705,13 +1673,25 @@
         <w:rPr>
           <w:rFonts w:ascii="Arial Narrow" w:hAnsi="Arial Narrow" w:cs="Arial"/>
         </w:rPr>
-        <w:t xml:space="preserve">5384 </w:t>
-      </w:r>
-      <w:r>
-        <w:rPr>
-          <w:rFonts w:ascii="Arial Narrow" w:hAnsi="Arial Narrow" w:cs="Arial"/>
-        </w:rPr>
-        <w:t>de 2025</w:t>
+        <w:t>1737</w:t>
+      </w:r>
+      <w:r>
+        <w:rPr>
+          <w:rFonts w:ascii="Arial Narrow" w:hAnsi="Arial Narrow" w:cs="Arial"/>
+        </w:rPr>
+        <w:t xml:space="preserve"> </w:t>
+      </w:r>
+      <w:r>
+        <w:rPr>
+          <w:rFonts w:ascii="Arial Narrow" w:hAnsi="Arial Narrow" w:cs="Arial"/>
+        </w:rPr>
+        <w:t>de 202</w:t>
+      </w:r>
+      <w:r>
+        <w:rPr>
+          <w:rFonts w:ascii="Arial Narrow" w:hAnsi="Arial Narrow" w:cs="Arial"/>
+        </w:rPr>
+        <w:t>6</w:t>
       </w:r>
       <w:r>
         <w:rPr>
@@ -1775,23 +1755,7 @@
           <w:rFonts w:ascii="Arial Narrow" w:hAnsi="Arial Narrow" w:cs="Arial"/>
           <w:i/>
         </w:rPr>
-        <w:t xml:space="preserve">La postulación a la línea de crédito </w:t>
-      </w:r>
-      <w:proofErr w:type="spellStart"/>
-      <w:r>
-        <w:rPr>
-          <w:rFonts w:ascii="Arial Narrow" w:hAnsi="Arial Narrow" w:cs="Arial"/>
-          <w:i/>
-        </w:rPr>
-        <w:t>condonable</w:t>
-      </w:r>
-      <w:proofErr w:type="spellEnd"/>
-      <w:r>
-        <w:rPr>
-          <w:rFonts w:ascii="Arial Narrow" w:hAnsi="Arial Narrow" w:cs="Arial"/>
-          <w:i/>
-        </w:rPr>
-        <w:t xml:space="preserve"> en pregrado, se debe realizar ingresando al sitio web oficial de la Agencia de Educación Postsecundaria de Medellín – SAPIENCIA, www.sapiencia.gov.co, dentro de las fechas previstas para ello, y teniendo en cuenta lo siguiente:</w:t>
+        <w:t>La postulación a la línea de crédito condonable en pregrado, se debe realizar ingresando al sitio web oficial de la Agencia de Educación Postsecundaria de Medellín – SAPIENCIA, www.sapiencia.gov.co, dentro de las fechas previstas para ello, y teniendo en cuenta lo siguiente:</w:t>
       </w:r>
     </w:p>
     <w:p>
@@ -1927,55 +1891,7 @@
           <w:u w:val="single"/>
         </w:rPr>
         <w:lastRenderedPageBreak/>
-        <w:t xml:space="preserve">del Distrito o que pueden ser consultadas en www.sapiencia.gov.co. La inscripción al programa significará que entiende y acepta las condiciones </w:t>
-      </w:r>
-      <w:proofErr w:type="gramStart"/>
-      <w:r>
-        <w:rPr>
-          <w:rFonts w:ascii="Arial Narrow" w:hAnsi="Arial Narrow" w:cs="Arial"/>
-          <w:b/>
-          <w:i/>
-          <w:sz w:val="24"/>
-          <w:szCs w:val="24"/>
-          <w:u w:val="single"/>
-        </w:rPr>
-        <w:t>del mismo</w:t>
-      </w:r>
-      <w:proofErr w:type="gramEnd"/>
-      <w:r>
-        <w:rPr>
-          <w:rFonts w:ascii="Arial Narrow" w:hAnsi="Arial Narrow" w:cs="Arial"/>
-          <w:b/>
-          <w:i/>
-          <w:sz w:val="24"/>
-          <w:szCs w:val="24"/>
-          <w:u w:val="single"/>
-        </w:rPr>
-        <w:t xml:space="preserve">. La inscripción implicará que entiende y acepta las condiciones </w:t>
-      </w:r>
-      <w:proofErr w:type="gramStart"/>
-      <w:r>
-        <w:rPr>
-          <w:rFonts w:ascii="Arial Narrow" w:hAnsi="Arial Narrow" w:cs="Arial"/>
-          <w:b/>
-          <w:i/>
-          <w:sz w:val="24"/>
-          <w:szCs w:val="24"/>
-          <w:u w:val="single"/>
-        </w:rPr>
-        <w:t>del mismo</w:t>
-      </w:r>
-      <w:proofErr w:type="gramEnd"/>
-      <w:r>
-        <w:rPr>
-          <w:rFonts w:ascii="Arial Narrow" w:hAnsi="Arial Narrow" w:cs="Arial"/>
-          <w:b/>
-          <w:i/>
-          <w:sz w:val="24"/>
-          <w:szCs w:val="24"/>
-          <w:u w:val="single"/>
-        </w:rPr>
-        <w:t>.</w:t>
+        <w:t>del Distrito o que pueden ser consultadas en www.sapiencia.gov.co. La inscripción al programa significará que entiende y acepta las condiciones del mismo. La inscripción implicará que entiende y acepta las condiciones del mismo.</w:t>
       </w:r>
     </w:p>
     <w:p>
@@ -1992,55 +1908,67 @@
           <w:rFonts w:ascii="Arial Narrow" w:hAnsi="Arial Narrow" w:cs="Arial"/>
           <w:bdr w:val="none" w:sz="0" w:space="0" w:color="auto" w:frame="1"/>
         </w:rPr>
-        <w:t>Así las cosas, la Entidad no puede acceder a lo solicitado por l</w:t>
+        <w:t xml:space="preserve">Así las cosas, la Entidad no puede acceder a lo solicitado, dado que, </w:t>
+      </w:r>
+      <w:r>
+        <w:rPr>
+          <w:rFonts w:ascii="Arial Narrow" w:hAnsi="Arial Narrow" w:cs="Arial"/>
+        </w:rPr>
+        <w:t>la calificación con respecto al caso en concreto, se realizó con base en la información brindada en el formulario de inscripci</w:t>
+      </w:r>
+      <w:r>
+        <w:rPr>
+          <w:rFonts w:ascii="Arial Narrow" w:hAnsi="Arial Narrow" w:cs="Arial"/>
+        </w:rPr>
+        <w:t>ón</w:t>
+      </w:r>
+      <w:r>
+        <w:rPr>
+          <w:rFonts w:ascii="Arial Narrow" w:hAnsi="Arial Narrow" w:cs="Arial"/>
+        </w:rPr>
+        <w:t xml:space="preserve">, de modo que, </w:t>
       </w:r>
       <w:r>
         <w:rPr>
           <w:rFonts w:ascii="Arial Narrow" w:hAnsi="Arial Narrow" w:cs="Arial"/>
           <w:bdr w:val="none" w:sz="0" w:space="0" w:color="auto" w:frame="1"/>
         </w:rPr>
-        <w:t>a</w:t>
+        <w:t xml:space="preserve">la causa por la que </w:t>
+      </w:r>
+      <w:r>
+        <w:rPr>
+          <w:rFonts w:ascii="Arial Narrow" w:hAnsi="Arial Narrow"/>
+          <w:b/>
+        </w:rPr>
+        <w:t xml:space="preserve">{{Nombre}} </w:t>
       </w:r>
       <w:r>
         <w:rPr>
           <w:rFonts w:ascii="Arial Narrow" w:hAnsi="Arial Narrow" w:cs="Arial"/>
           <w:bdr w:val="none" w:sz="0" w:space="0" w:color="auto" w:frame="1"/>
         </w:rPr>
-        <w:t xml:space="preserve"> aspirante, dado que, </w:t>
-      </w:r>
-      <w:r>
-        <w:rPr>
-          <w:rFonts w:ascii="Arial Narrow" w:hAnsi="Arial Narrow" w:cs="Arial"/>
-        </w:rPr>
-        <w:t xml:space="preserve">la calificación con respecto al caso en concreto, se realizó con base en la información brindada en el formulario de inscripciones, de modo que, </w:t>
+        <w:t>no continuó</w:t>
       </w:r>
       <w:r>
         <w:rPr>
           <w:rFonts w:ascii="Arial Narrow" w:hAnsi="Arial Narrow" w:cs="Arial"/>
           <w:bdr w:val="none" w:sz="0" w:space="0" w:color="auto" w:frame="1"/>
         </w:rPr>
-        <w:t xml:space="preserve">la causa por la que </w:t>
-      </w:r>
-      <w:r>
-        <w:rPr>
-          <w:rFonts w:ascii="Arial Narrow" w:hAnsi="Arial Narrow"/>
-          <w:b/>
-        </w:rPr>
-        <w:t xml:space="preserve">{{Nombre}} </w:t>
+        <w:t xml:space="preserve"> en la convocatoria, se encuentra supeditado a que no cumplió con el requisito habilitante anteriormente mencionado en la presente convocatoria para la línea de crédito de pregrado en las fuente de financiación de </w:t>
       </w:r>
       <w:r>
         <w:rPr>
           <w:rFonts w:ascii="Arial Narrow" w:hAnsi="Arial Narrow" w:cs="Arial"/>
           <w:bdr w:val="none" w:sz="0" w:space="0" w:color="auto" w:frame="1"/>
         </w:rPr>
-        <w:t>no continuó</w:t>
+        <w:t>{{fuente_escogida}}</w:t>
       </w:r>
       <w:r>
         <w:rPr>
           <w:rFonts w:ascii="Arial Narrow" w:hAnsi="Arial Narrow" w:cs="Arial"/>
           <w:bdr w:val="none" w:sz="0" w:space="0" w:color="auto" w:frame="1"/>
         </w:rPr>
-        <w:t xml:space="preserve"> en la convocatoria, se encuentra supeditado a que no cumplió con el requisito habilitante anteriormente mencionado en la presente convocatoria para la línea de crédito de pregrado en las fuente de financiación de Presupuesto Participativo, ratificándose así, la decisión ya notificada vía correo electrónico; </w:t>
+        <w:t xml:space="preserve">, ratificándose así, la decisión ya notificada vía correo electrónico; </w:t>
       </w:r>
       <w:r>
         <w:rPr>
@@ -2406,145 +2334,6 @@
           <w:p>
             <w:pPr>
               <w:pStyle w:val="Sinespaciado"/>
-              <w:rPr>
-                <w:rFonts w:ascii="Arial Narrow" w:hAnsi="Arial Narrow"/>
-                <w:kern w:val="2"/>
-                <w:sz w:val="24"/>
-                <w:szCs w:val="24"/>
-                <w14:ligatures w14:val="standardContextual"/>
-              </w:rPr>
-            </w:pPr>
-            <w:r>
-              <w:rPr>
-                <w:rFonts w:ascii="Arial Narrow" w:hAnsi="Arial Narrow"/>
-                <w:kern w:val="2"/>
-                <w:sz w:val="24"/>
-                <w:szCs w:val="24"/>
-                <w14:ligatures w14:val="standardContextual"/>
-              </w:rPr>
-              <w:t>Daniel Felipe Zapata Vélez</w:t>
-            </w:r>
-          </w:p>
-          <w:p>
-            <w:pPr>
-              <w:pStyle w:val="Sinespaciado"/>
-              <w:rPr>
-                <w:rFonts w:ascii="Arial Narrow" w:hAnsi="Arial Narrow"/>
-                <w:kern w:val="2"/>
-                <w:sz w:val="24"/>
-                <w:szCs w:val="24"/>
-                <w14:ligatures w14:val="standardContextual"/>
-              </w:rPr>
-            </w:pPr>
-          </w:p>
-          <w:p>
-            <w:pPr>
-              <w:pStyle w:val="Sinespaciado"/>
-              <w:rPr>
-                <w:rFonts w:ascii="Arial Narrow" w:hAnsi="Arial Narrow"/>
-                <w:kern w:val="2"/>
-                <w:sz w:val="24"/>
-                <w:szCs w:val="24"/>
-                <w14:ligatures w14:val="standardContextual"/>
-              </w:rPr>
-            </w:pPr>
-            <w:r>
-              <w:rPr>
-                <w:rFonts w:ascii="Arial Narrow" w:hAnsi="Arial Narrow"/>
-                <w:kern w:val="2"/>
-                <w:sz w:val="24"/>
-                <w:szCs w:val="24"/>
-                <w14:ligatures w14:val="standardContextual"/>
-              </w:rPr>
-              <w:t xml:space="preserve">Contratista Profesional Apoyo Técnico Dirección Técnica de Fondos </w:t>
-            </w:r>
-          </w:p>
-          <w:p>
-            <w:pPr>
-              <w:pStyle w:val="Sinespaciado"/>
-              <w:jc w:val="center"/>
-              <w:rPr>
-                <w:rFonts w:ascii="Arial Narrow" w:hAnsi="Arial Narrow"/>
-                <w:kern w:val="2"/>
-                <w:sz w:val="24"/>
-                <w:szCs w:val="24"/>
-                <w14:ligatures w14:val="standardContextual"/>
-              </w:rPr>
-            </w:pPr>
-            <w:r>
-              <w:rPr>
-                <w:rFonts w:ascii="Arial Narrow" w:hAnsi="Arial Narrow"/>
-                <w:noProof/>
-                <w:kern w:val="2"/>
-                <w:sz w:val="24"/>
-                <w:szCs w:val="24"/>
-                <w:lang w:eastAsia="es-CO"/>
-                <w14:ligatures w14:val="standardContextual"/>
-              </w:rPr>
-              <w:drawing>
-                <wp:anchor distT="0" distB="0" distL="114300" distR="114300" simplePos="0" relativeHeight="251659776" behindDoc="1" locked="0" layoutInCell="1" allowOverlap="1" wp14:anchorId="1EA0AF19" wp14:editId="470B2B16">
-                  <wp:simplePos x="0" y="0"/>
-                  <wp:positionH relativeFrom="column">
-                    <wp:posOffset>198120</wp:posOffset>
-                  </wp:positionH>
-                  <wp:positionV relativeFrom="paragraph">
-                    <wp:posOffset>62865</wp:posOffset>
-                  </wp:positionV>
-                  <wp:extent cx="603250" cy="422910"/>
-                  <wp:effectExtent l="0" t="0" r="6350" b="0"/>
-                  <wp:wrapNone/>
-                  <wp:docPr id="6" name="Imagen 6"/>
-                  <wp:cNvGraphicFramePr>
-                    <a:graphicFrameLocks xmlns:a="http://schemas.openxmlformats.org/drawingml/2006/main" noChangeAspect="1"/>
-                  </wp:cNvGraphicFramePr>
-                  <a:graphic xmlns:a="http://schemas.openxmlformats.org/drawingml/2006/main">
-                    <a:graphicData uri="http://schemas.openxmlformats.org/drawingml/2006/picture">
-                      <pic:pic xmlns:pic="http://schemas.openxmlformats.org/drawingml/2006/picture">
-                        <pic:nvPicPr>
-                          <pic:cNvPr id="0" name="Imagen 24"/>
-                          <pic:cNvPicPr>
-                            <a:picLocks noChangeAspect="1" noChangeArrowheads="1"/>
-                          </pic:cNvPicPr>
-                        </pic:nvPicPr>
-                        <pic:blipFill>
-                          <a:blip r:embed="rId12" cstate="print">
-                            <a:extLst>
-                              <a:ext uri="{28A0092B-C50C-407E-A947-70E740481C1C}">
-                                <a14:useLocalDpi xmlns:a14="http://schemas.microsoft.com/office/drawing/2010/main" val="0"/>
-                              </a:ext>
-                            </a:extLst>
-                          </a:blip>
-                          <a:srcRect/>
-                          <a:stretch>
-                            <a:fillRect/>
-                          </a:stretch>
-                        </pic:blipFill>
-                        <pic:spPr bwMode="auto">
-                          <a:xfrm>
-                            <a:off x="0" y="0"/>
-                            <a:ext cx="603250" cy="422910"/>
-                          </a:xfrm>
-                          <a:prstGeom prst="rect">
-                            <a:avLst/>
-                          </a:prstGeom>
-                          <a:noFill/>
-                        </pic:spPr>
-                      </pic:pic>
-                    </a:graphicData>
-                  </a:graphic>
-                  <wp14:sizeRelH relativeFrom="margin">
-                    <wp14:pctWidth>0</wp14:pctWidth>
-                  </wp14:sizeRelH>
-                  <wp14:sizeRelV relativeFrom="margin">
-                    <wp14:pctHeight>0</wp14:pctHeight>
-                  </wp14:sizeRelV>
-                </wp:anchor>
-              </w:drawing>
-            </w:r>
-          </w:p>
-          <w:p>
-            <w:pPr>
-              <w:pStyle w:val="Sinespaciado"/>
               <w:jc w:val="center"/>
               <w:rPr>
                 <w:rFonts w:ascii="Arial Narrow" w:hAnsi="Arial Narrow"/>
@@ -2600,151 +2389,6 @@
                 <w14:ligatures w14:val="standardContextual"/>
               </w:rPr>
             </w:pPr>
-            <w:r>
-              <w:rPr>
-                <w:rFonts w:ascii="Arial Narrow" w:hAnsi="Arial Narrow"/>
-                <w:kern w:val="2"/>
-                <w:sz w:val="24"/>
-                <w:szCs w:val="24"/>
-                <w14:ligatures w14:val="standardContextual"/>
-              </w:rPr>
-              <w:t xml:space="preserve">Genaro Alfonso </w:t>
-            </w:r>
-            <w:r>
-              <w:rPr>
-                <w:rFonts w:ascii="Arial Narrow" w:hAnsi="Arial Narrow"/>
-                <w:kern w:val="2"/>
-                <w:sz w:val="24"/>
-                <w:szCs w:val="24"/>
-                <w14:ligatures w14:val="standardContextual"/>
-              </w:rPr>
-              <w:t>Aristizabal Echeverri</w:t>
-            </w:r>
-          </w:p>
-          <w:p>
-            <w:pPr>
-              <w:pStyle w:val="Sinespaciado"/>
-              <w:rPr>
-                <w:rFonts w:ascii="Arial Narrow" w:hAnsi="Arial Narrow"/>
-                <w:kern w:val="2"/>
-                <w:sz w:val="24"/>
-                <w:szCs w:val="24"/>
-                <w14:ligatures w14:val="standardContextual"/>
-              </w:rPr>
-            </w:pPr>
-          </w:p>
-          <w:p>
-            <w:pPr>
-              <w:pStyle w:val="Sinespaciado"/>
-              <w:rPr>
-                <w:rFonts w:ascii="Arial Narrow" w:hAnsi="Arial Narrow"/>
-                <w:kern w:val="2"/>
-                <w:sz w:val="24"/>
-                <w:szCs w:val="24"/>
-                <w14:ligatures w14:val="standardContextual"/>
-              </w:rPr>
-            </w:pPr>
-            <w:r>
-              <w:rPr>
-                <w:rFonts w:ascii="Arial Narrow" w:hAnsi="Arial Narrow"/>
-                <w:kern w:val="2"/>
-                <w:sz w:val="24"/>
-                <w:szCs w:val="24"/>
-                <w14:ligatures w14:val="standardContextual"/>
-              </w:rPr>
-              <w:t xml:space="preserve">Contratista Profesional Apoyo Dirección Técnica de Fondos </w:t>
-            </w:r>
-          </w:p>
-          <w:p>
-            <w:pPr>
-              <w:pStyle w:val="Sinespaciado"/>
-              <w:rPr>
-                <w:rFonts w:ascii="Arial Narrow" w:hAnsi="Arial Narrow"/>
-                <w:kern w:val="2"/>
-                <w:sz w:val="24"/>
-                <w:szCs w:val="24"/>
-                <w14:ligatures w14:val="standardContextual"/>
-              </w:rPr>
-            </w:pPr>
-            <w:r>
-              <w:rPr>
-                <w:rFonts w:ascii="Arial Narrow" w:hAnsi="Arial Narrow"/>
-                <w:noProof/>
-                <w:kern w:val="2"/>
-                <w:sz w:val="24"/>
-                <w:szCs w:val="24"/>
-                <w:lang w:eastAsia="es-CO"/>
-                <w14:ligatures w14:val="standardContextual"/>
-              </w:rPr>
-              <w:drawing>
-                <wp:anchor distT="0" distB="0" distL="114300" distR="114300" simplePos="0" relativeHeight="251660800" behindDoc="1" locked="0" layoutInCell="1" allowOverlap="1" wp14:anchorId="1506AFC9" wp14:editId="6DB5DD27">
-                  <wp:simplePos x="0" y="0"/>
-                  <wp:positionH relativeFrom="column">
-                    <wp:posOffset>181527</wp:posOffset>
-                  </wp:positionH>
-                  <wp:positionV relativeFrom="paragraph">
-                    <wp:posOffset>42190</wp:posOffset>
-                  </wp:positionV>
-                  <wp:extent cx="754083" cy="358536"/>
-                  <wp:effectExtent l="0" t="0" r="8255" b="3810"/>
-                  <wp:wrapNone/>
-                  <wp:docPr id="3" name="Imagen 3" descr="C:\Users\genaro.aristizabal\Sapiencia\Gen_Fondos - Documentos\Firma.PNG"/>
-                  <wp:cNvGraphicFramePr>
-                    <a:graphicFrameLocks xmlns:a="http://schemas.openxmlformats.org/drawingml/2006/main" noChangeAspect="1"/>
-                  </wp:cNvGraphicFramePr>
-                  <a:graphic xmlns:a="http://schemas.openxmlformats.org/drawingml/2006/main">
-                    <a:graphicData uri="http://schemas.openxmlformats.org/drawingml/2006/picture">
-                      <pic:pic xmlns:pic="http://schemas.openxmlformats.org/drawingml/2006/picture">
-                        <pic:nvPicPr>
-                          <pic:cNvPr id="0" name="Picture 1" descr="C:\Users\genaro.aristizabal\Sapiencia\Gen_Fondos - Documentos\Firma.PNG"/>
-                          <pic:cNvPicPr>
-                            <a:picLocks noChangeAspect="1" noChangeArrowheads="1"/>
-                          </pic:cNvPicPr>
-                        </pic:nvPicPr>
-                        <pic:blipFill>
-                          <a:blip r:embed="rId13" cstate="print">
-                            <a:extLst>
-                              <a:ext uri="{28A0092B-C50C-407E-A947-70E740481C1C}">
-                                <a14:useLocalDpi xmlns:a14="http://schemas.microsoft.com/office/drawing/2010/main" val="0"/>
-                              </a:ext>
-                            </a:extLst>
-                          </a:blip>
-                          <a:srcRect/>
-                          <a:stretch>
-                            <a:fillRect/>
-                          </a:stretch>
-                        </pic:blipFill>
-                        <pic:spPr bwMode="auto">
-                          <a:xfrm>
-                            <a:off x="0" y="0"/>
-                            <a:ext cx="754083" cy="358536"/>
-                          </a:xfrm>
-                          <a:prstGeom prst="rect">
-                            <a:avLst/>
-                          </a:prstGeom>
-                          <a:noFill/>
-                          <a:ln>
-                            <a:noFill/>
-                          </a:ln>
-                        </pic:spPr>
-                      </pic:pic>
-                    </a:graphicData>
-                  </a:graphic>
-                </wp:anchor>
-              </w:drawing>
-            </w:r>
-          </w:p>
-          <w:p>
-            <w:pPr>
-              <w:pStyle w:val="Sinespaciado"/>
-              <w:rPr>
-                <w:rFonts w:ascii="Arial Narrow" w:hAnsi="Arial Narrow"/>
-                <w:kern w:val="2"/>
-                <w:sz w:val="24"/>
-                <w:szCs w:val="24"/>
-                <w14:ligatures w14:val="standardContextual"/>
-              </w:rPr>
-            </w:pPr>
           </w:p>
         </w:tc>
         <w:tc>
@@ -2768,50 +2412,6 @@
                 <w14:ligatures w14:val="standardContextual"/>
               </w:rPr>
             </w:pPr>
-            <w:r>
-              <w:rPr>
-                <w:rFonts w:ascii="Arial Narrow" w:hAnsi="Arial Narrow"/>
-                <w:kern w:val="2"/>
-                <w:sz w:val="24"/>
-                <w:szCs w:val="24"/>
-                <w14:ligatures w14:val="standardContextual"/>
-              </w:rPr>
-              <w:t>Pablo Adolfo Hoyos González</w:t>
-            </w:r>
-          </w:p>
-          <w:p>
-            <w:pPr>
-              <w:pStyle w:val="Sinespaciado"/>
-              <w:rPr>
-                <w:rFonts w:ascii="Arial Narrow" w:hAnsi="Arial Narrow"/>
-                <w:kern w:val="2"/>
-                <w:sz w:val="24"/>
-                <w:szCs w:val="24"/>
-                <w14:ligatures w14:val="standardContextual"/>
-              </w:rPr>
-            </w:pPr>
-          </w:p>
-          <w:p>
-            <w:pPr>
-              <w:pStyle w:val="Sinespaciado"/>
-              <w:rPr>
-                <w:rFonts w:ascii="Arial Narrow" w:hAnsi="Arial Narrow"/>
-                <w:kern w:val="2"/>
-                <w:sz w:val="24"/>
-                <w:szCs w:val="24"/>
-                <w14:ligatures w14:val="standardContextual"/>
-              </w:rPr>
-            </w:pPr>
-            <w:r>
-              <w:rPr>
-                <w:rFonts w:ascii="Arial Narrow" w:hAnsi="Arial Narrow"/>
-                <w:kern w:val="2"/>
-                <w:sz w:val="24"/>
-                <w:szCs w:val="24"/>
-                <w14:ligatures w14:val="standardContextual"/>
-              </w:rPr>
-              <w:t>Abogado Contratista Dirección Técnica de Fondos</w:t>
-            </w:r>
           </w:p>
         </w:tc>
       </w:tr>
@@ -2845,8 +2445,8 @@
       </w:r>
     </w:p>
     <w:sectPr>
-      <w:headerReference w:type="default" r:id="rId14"/>
-      <w:footerReference w:type="default" r:id="rId15"/>
+      <w:headerReference w:type="default" r:id="rId12"/>
+      <w:footerReference w:type="default" r:id="rId13"/>
       <w:pgSz w:w="12240" w:h="15840"/>
       <w:pgMar w:top="1417" w:right="1041" w:bottom="1417" w:left="1275" w:header="708" w:footer="708" w:gutter="0"/>
       <w:cols w:space="708"/>
@@ -5845,30 +5445,6 @@
 </file>
 
 <file path=customXml/item1.xml><?xml version="1.0" encoding="utf-8"?>
-<?mso-contentType ?>
-<FormTemplates xmlns="http://schemas.microsoft.com/sharepoint/v3/contenttype/forms">
-  <Display>DocumentLibraryForm</Display>
-  <Edit>DocumentLibraryForm</Edit>
-  <New>DocumentLibraryForm</New>
-</FormTemplates>
-</file>
-
-<file path=customXml/item2.xml><?xml version="1.0" encoding="utf-8"?>
-<b:Sources xmlns:b="http://schemas.openxmlformats.org/officeDocument/2006/bibliography" xmlns="http://schemas.openxmlformats.org/officeDocument/2006/bibliography" SelectedStyle="\APASixthEditionOfficeOnline.xsl" StyleName="APA" Version="6"/>
-</file>
-
-<file path=customXml/item3.xml><?xml version="1.0" encoding="utf-8"?>
-<p:properties xmlns:p="http://schemas.microsoft.com/office/2006/metadata/properties" xmlns:xsi="http://www.w3.org/2001/XMLSchema-instance" xmlns:pc="http://schemas.microsoft.com/office/infopath/2007/PartnerControls">
-  <documentManagement>
-    <TaxCatchAll xmlns="89c07dc6-a914-4a48-b388-dfe830e5bbb3" xsi:nil="true"/>
-    <lcf76f155ced4ddcb4097134ff3c332f xmlns="b3f023d8-5d21-4a64-81dc-e4e2f442a49c">
-      <Terms xmlns="http://schemas.microsoft.com/office/infopath/2007/PartnerControls"/>
-    </lcf76f155ced4ddcb4097134ff3c332f>
-  </documentManagement>
-</p:properties>
-</file>
-
-<file path=customXml/item4.xml><?xml version="1.0" encoding="utf-8"?>
 <ct:contentTypeSchema xmlns:ct="http://schemas.microsoft.com/office/2006/metadata/contentType" xmlns:ma="http://schemas.microsoft.com/office/2006/metadata/properties/metaAttributes" ct:_="" ma:_="" ma:contentTypeName="Documento" ma:contentTypeID="0x010100D9CCCA44E2C99944BAE64B502DE3FD2A" ma:contentTypeVersion="14" ma:contentTypeDescription="Crear nuevo documento." ma:contentTypeScope="" ma:versionID="541d41fcd197c0a462c12f5c2f31ff2c">
   <xsd:schema xmlns:xsd="http://www.w3.org/2001/XMLSchema" xmlns:xs="http://www.w3.org/2001/XMLSchema" xmlns:p="http://schemas.microsoft.com/office/2006/metadata/properties" xmlns:ns2="b3f023d8-5d21-4a64-81dc-e4e2f442a49c" xmlns:ns3="89c07dc6-a914-4a48-b388-dfe830e5bbb3" targetNamespace="http://schemas.microsoft.com/office/2006/metadata/properties" ma:root="true" ma:fieldsID="a98b3da299219d0f4bb583511f000a27" ns2:_="" ns3:_="">
     <xsd:import namespace="b3f023d8-5d21-4a64-81dc-e4e2f442a49c"/>
@@ -6097,34 +5673,31 @@
 </ct:contentTypeSchema>
 </file>
 
-<file path=customXml/itemProps1.xml><?xml version="1.0" encoding="utf-8"?>
-<ds:datastoreItem xmlns:ds="http://schemas.openxmlformats.org/officeDocument/2006/customXml" ds:itemID="{B5303028-1E1D-4329-8F7C-A4173A0F993A}">
-  <ds:schemaRefs>
-    <ds:schemaRef ds:uri="http://schemas.microsoft.com/sharepoint/v3/contenttype/forms"/>
-  </ds:schemaRefs>
-</ds:datastoreItem>
+<file path=customXml/item2.xml><?xml version="1.0" encoding="utf-8"?>
+<p:properties xmlns:p="http://schemas.microsoft.com/office/2006/metadata/properties" xmlns:xsi="http://www.w3.org/2001/XMLSchema-instance" xmlns:pc="http://schemas.microsoft.com/office/infopath/2007/PartnerControls">
+  <documentManagement>
+    <TaxCatchAll xmlns="89c07dc6-a914-4a48-b388-dfe830e5bbb3" xsi:nil="true"/>
+    <lcf76f155ced4ddcb4097134ff3c332f xmlns="b3f023d8-5d21-4a64-81dc-e4e2f442a49c">
+      <Terms xmlns="http://schemas.microsoft.com/office/infopath/2007/PartnerControls"/>
+    </lcf76f155ced4ddcb4097134ff3c332f>
+  </documentManagement>
+</p:properties>
 </file>
 
-<file path=customXml/itemProps2.xml><?xml version="1.0" encoding="utf-8"?>
-<ds:datastoreItem xmlns:ds="http://schemas.openxmlformats.org/officeDocument/2006/customXml" ds:itemID="{FF763E41-D5FE-4F3F-AA79-438AE1A918DF}">
-  <ds:schemaRefs>
-    <ds:schemaRef ds:uri="http://schemas.openxmlformats.org/officeDocument/2006/bibliography"/>
-  </ds:schemaRefs>
-</ds:datastoreItem>
+<file path=customXml/item3.xml><?xml version="1.0" encoding="utf-8"?>
+<b:Sources xmlns:b="http://schemas.openxmlformats.org/officeDocument/2006/bibliography" xmlns="http://schemas.openxmlformats.org/officeDocument/2006/bibliography" SelectedStyle="\APASixthEditionOfficeOnline.xsl" StyleName="APA" Version="6"/>
 </file>
 
-<file path=customXml/itemProps3.xml><?xml version="1.0" encoding="utf-8"?>
-<ds:datastoreItem xmlns:ds="http://schemas.openxmlformats.org/officeDocument/2006/customXml" ds:itemID="{AAD997A6-A5A0-4F9D-9D70-683CECCE6EDD}">
-  <ds:schemaRefs>
-    <ds:schemaRef ds:uri="http://schemas.microsoft.com/office/2006/metadata/properties"/>
-    <ds:schemaRef ds:uri="http://schemas.microsoft.com/office/infopath/2007/PartnerControls"/>
-    <ds:schemaRef ds:uri="89c07dc6-a914-4a48-b388-dfe830e5bbb3"/>
-    <ds:schemaRef ds:uri="b3f023d8-5d21-4a64-81dc-e4e2f442a49c"/>
-  </ds:schemaRefs>
-</ds:datastoreItem>
+<file path=customXml/item4.xml><?xml version="1.0" encoding="utf-8"?>
+<?mso-contentType ?>
+<FormTemplates xmlns="http://schemas.microsoft.com/sharepoint/v3/contenttype/forms">
+  <Display>DocumentLibraryForm</Display>
+  <Edit>DocumentLibraryForm</Edit>
+  <New>DocumentLibraryForm</New>
+</FormTemplates>
 </file>
 
-<file path=customXml/itemProps4.xml><?xml version="1.0" encoding="utf-8"?>
+<file path=customXml/itemProps1.xml><?xml version="1.0" encoding="utf-8"?>
 <ds:datastoreItem xmlns:ds="http://schemas.openxmlformats.org/officeDocument/2006/customXml" ds:itemID="{3F2C3356-243B-4E64-98E4-CD3EAEDDE24C}">
   <ds:schemaRefs>
     <ds:schemaRef ds:uri="http://schemas.microsoft.com/office/2006/metadata/contentType"/>
@@ -6141,4 +5714,31 @@
     <ds:schemaRef ds:uri="http://schemas.microsoft.com/internal/obd"/>
   </ds:schemaRefs>
 </ds:datastoreItem>
+</file>
+
+<file path=customXml/itemProps2.xml><?xml version="1.0" encoding="utf-8"?>
+<ds:datastoreItem xmlns:ds="http://schemas.openxmlformats.org/officeDocument/2006/customXml" ds:itemID="{AAD997A6-A5A0-4F9D-9D70-683CECCE6EDD}">
+  <ds:schemaRefs>
+    <ds:schemaRef ds:uri="http://schemas.microsoft.com/office/2006/metadata/properties"/>
+    <ds:schemaRef ds:uri="http://schemas.microsoft.com/office/infopath/2007/PartnerControls"/>
+    <ds:schemaRef ds:uri="89c07dc6-a914-4a48-b388-dfe830e5bbb3"/>
+    <ds:schemaRef ds:uri="b3f023d8-5d21-4a64-81dc-e4e2f442a49c"/>
+  </ds:schemaRefs>
+</ds:datastoreItem>
+</file>
+
+<file path=customXml/itemProps3.xml><?xml version="1.0" encoding="utf-8"?>
+<ds:datastoreItem xmlns:ds="http://schemas.openxmlformats.org/officeDocument/2006/customXml" ds:itemID="{FF763E41-D5FE-4F3F-AA79-438AE1A918DF}">
+  <ds:schemaRefs>
+    <ds:schemaRef ds:uri="http://schemas.openxmlformats.org/officeDocument/2006/bibliography"/>
+  </ds:schemaRefs>
+</ds:datastoreItem>
+</file>
+
+<file path=customXml/itemProps4.xml><?xml version="1.0" encoding="utf-8"?>
+<ds:datastoreItem xmlns:ds="http://schemas.openxmlformats.org/officeDocument/2006/customXml" ds:itemID="{B5303028-1E1D-4329-8F7C-A4173A0F993A}">
+  <ds:schemaRefs>
+    <ds:schemaRef ds:uri="http://schemas.microsoft.com/sharepoint/v3/contenttype/forms"/>
+  </ds:schemaRefs>
+</ds:datastoreItem>
 </file>
</xml_diff>

<commit_message>
Actualización formatos de PQRS
</commit_message>
<xml_diff>
--- a/Impedido_literal_a.docx
+++ b/Impedido_literal_a.docx
@@ -1,6 +1,6 @@
 
 <file path=word/document.xml><?xml version="1.0" encoding="utf-8"?>
-<w:document xmlns:wpc="http://schemas.microsoft.com/office/word/2010/wordprocessingCanvas" xmlns:cx="http://schemas.microsoft.com/office/drawing/2014/chartex" xmlns:cx1="http://schemas.microsoft.com/office/drawing/2015/9/8/chartex" xmlns:cx2="http://schemas.microsoft.com/office/drawing/2015/10/21/chartex" xmlns:cx3="http://schemas.microsoft.com/office/drawing/2016/5/9/chartex" xmlns:cx4="http://schemas.microsoft.com/office/drawing/2016/5/10/chartex" xmlns:cx5="http://schemas.microsoft.com/office/drawing/2016/5/11/chartex" xmlns:cx6="http://schemas.microsoft.com/office/drawing/2016/5/12/chartex" xmlns:cx7="http://schemas.microsoft.com/office/drawing/2016/5/13/chartex" xmlns:cx8="http://schemas.microsoft.com/office/drawing/2016/5/14/chartex" xmlns:mc="http://schemas.openxmlformats.org/markup-compatibility/2006" xmlns:aink="http://schemas.microsoft.com/office/drawing/2016/ink" xmlns:am3d="http://schemas.microsoft.com/office/drawing/2017/model3d" xmlns:o="urn:schemas-microsoft-com:office:office" xmlns:oel="http://schemas.microsoft.com/office/2019/extlst" xmlns:r="http://schemas.openxmlformats.org/officeDocument/2006/relationships" xmlns:m="http://schemas.openxmlformats.org/officeDocument/2006/math" xmlns:v="urn:schemas-microsoft-com:vml" xmlns:wp14="http://schemas.microsoft.com/office/word/2010/wordprocessingDrawing" xmlns:wp="http://schemas.openxmlformats.org/drawingml/2006/wordprocessingDrawing" xmlns:w10="urn:schemas-microsoft-com:office:word" xmlns:w="http://schemas.openxmlformats.org/wordprocessingml/2006/main" xmlns:w14="http://schemas.microsoft.com/office/word/2010/wordml" xmlns:w15="http://schemas.microsoft.com/office/word/2012/wordml" xmlns:w16cex="http://schemas.microsoft.com/office/word/2018/wordml/cex" xmlns:w16cid="http://schemas.microsoft.com/office/word/2016/wordml/cid" xmlns:w16="http://schemas.microsoft.com/office/word/2018/wordml" xmlns:w16du="http://schemas.microsoft.com/office/word/2023/wordml/word16du" xmlns:w16sdtdh="http://schemas.microsoft.com/office/word/2020/wordml/sdtdatahash" xmlns:w16sdtfl="http://schemas.microsoft.com/office/word/2024/wordml/sdtformatlock" xmlns:w16se="http://schemas.microsoft.com/office/word/2015/wordml/symex" xmlns:wpg="http://schemas.microsoft.com/office/word/2010/wordprocessingGroup" xmlns:wpi="http://schemas.microsoft.com/office/word/2010/wordprocessingInk" xmlns:wne="http://schemas.microsoft.com/office/word/2006/wordml" xmlns:wps="http://schemas.microsoft.com/office/word/2010/wordprocessingShape" mc:Ignorable="w14 w15 w16se w16cid w16 w16cex w16sdtdh w16sdtfl w16du wp14">
+<w:document xmlns:wpc="http://schemas.microsoft.com/office/word/2010/wordprocessingCanvas" xmlns:cx="http://schemas.microsoft.com/office/drawing/2014/chartex" xmlns:cx1="http://schemas.microsoft.com/office/drawing/2015/9/8/chartex" xmlns:mc="http://schemas.openxmlformats.org/markup-compatibility/2006" xmlns:o="urn:schemas-microsoft-com:office:office" xmlns:r="http://schemas.openxmlformats.org/officeDocument/2006/relationships" xmlns:m="http://schemas.openxmlformats.org/officeDocument/2006/math" xmlns:v="urn:schemas-microsoft-com:vml" xmlns:wp14="http://schemas.microsoft.com/office/word/2010/wordprocessingDrawing" xmlns:wp="http://schemas.openxmlformats.org/drawingml/2006/wordprocessingDrawing" xmlns:w10="urn:schemas-microsoft-com:office:word" xmlns:w="http://schemas.openxmlformats.org/wordprocessingml/2006/main" xmlns:w14="http://schemas.microsoft.com/office/word/2010/wordml" xmlns:w15="http://schemas.microsoft.com/office/word/2012/wordml" xmlns:w16se="http://schemas.microsoft.com/office/word/2015/wordml/symex" xmlns:wpg="http://schemas.microsoft.com/office/word/2010/wordprocessingGroup" xmlns:wpi="http://schemas.microsoft.com/office/word/2010/wordprocessingInk" xmlns:wne="http://schemas.microsoft.com/office/word/2006/wordml" xmlns:wps="http://schemas.microsoft.com/office/word/2010/wordprocessingShape" mc:Ignorable="w14 w15 w16se wp14">
   <w:body>
     <w:p>
       <w:pPr>
@@ -218,7 +218,23 @@
           <w:rFonts w:ascii="Arial Narrow" w:hAnsi="Arial Narrow" w:cs="Arial"/>
           <w:bCs/>
         </w:rPr>
-        <w:t>{{Celular}} – {{CelularAlterno}}</w:t>
+        <w:t>{{Celular}} – {{</w:t>
+      </w:r>
+      <w:proofErr w:type="spellStart"/>
+      <w:r>
+        <w:rPr>
+          <w:rFonts w:ascii="Arial Narrow" w:hAnsi="Arial Narrow" w:cs="Arial"/>
+          <w:bCs/>
+        </w:rPr>
+        <w:t>CelularAlterno</w:t>
+      </w:r>
+      <w:proofErr w:type="spellEnd"/>
+      <w:r>
+        <w:rPr>
+          <w:rFonts w:ascii="Arial Narrow" w:hAnsi="Arial Narrow" w:cs="Arial"/>
+          <w:bCs/>
+        </w:rPr>
+        <w:t>}}</w:t>
       </w:r>
     </w:p>
     <w:p>
@@ -473,14 +489,32 @@
           <w:color w:val="000000"/>
           <w:lang w:eastAsia="es-CO"/>
         </w:rPr>
-        <w:t>Usted se presentó al Programa Único de Acceso y Permanencia – PUAP, en la línea de créditos condonables de pregrado en la fuente de financiación de</w:t>
-      </w:r>
+        <w:t xml:space="preserve">Usted se presentó al Programa Único de Acceso y Permanencia – PUAP, en la línea de créditos </w:t>
+      </w:r>
+      <w:proofErr w:type="spellStart"/>
       <w:r>
         <w:rPr>
           <w:rFonts w:ascii="Arial Narrow" w:hAnsi="Arial Narrow" w:cs="Arial"/>
           <w:color w:val="000000"/>
           <w:lang w:eastAsia="es-CO"/>
         </w:rPr>
+        <w:t>condonables</w:t>
+      </w:r>
+      <w:proofErr w:type="spellEnd"/>
+      <w:r>
+        <w:rPr>
+          <w:rFonts w:ascii="Arial Narrow" w:hAnsi="Arial Narrow" w:cs="Arial"/>
+          <w:color w:val="000000"/>
+          <w:lang w:eastAsia="es-CO"/>
+        </w:rPr>
+        <w:t xml:space="preserve"> de pregrado en la fuente de financiación de</w:t>
+      </w:r>
+      <w:r>
+        <w:rPr>
+          <w:rFonts w:ascii="Arial Narrow" w:hAnsi="Arial Narrow" w:cs="Arial"/>
+          <w:color w:val="000000"/>
+          <w:lang w:eastAsia="es-CO"/>
+        </w:rPr>
         <w:t xml:space="preserve"> </w:t>
       </w:r>
       <w:r>
@@ -488,7 +522,23 @@
           <w:rFonts w:ascii="Arial Narrow" w:hAnsi="Arial Narrow" w:cs="Arial"/>
           <w:bdr w:val="none" w:sz="0" w:space="0" w:color="auto" w:frame="1"/>
         </w:rPr>
-        <w:t xml:space="preserve">{{fuente_escogida}} </w:t>
+        <w:t>{{</w:t>
+      </w:r>
+      <w:proofErr w:type="spellStart"/>
+      <w:r>
+        <w:rPr>
+          <w:rFonts w:ascii="Arial Narrow" w:hAnsi="Arial Narrow" w:cs="Arial"/>
+          <w:bdr w:val="none" w:sz="0" w:space="0" w:color="auto" w:frame="1"/>
+        </w:rPr>
+        <w:t>fuente_escogida</w:t>
+      </w:r>
+      <w:proofErr w:type="spellEnd"/>
+      <w:r>
+        <w:rPr>
+          <w:rFonts w:ascii="Arial Narrow" w:hAnsi="Arial Narrow" w:cs="Arial"/>
+          <w:bdr w:val="none" w:sz="0" w:space="0" w:color="auto" w:frame="1"/>
+        </w:rPr>
+        <w:t xml:space="preserve">}} </w:t>
       </w:r>
       <w:r>
         <w:rPr>
@@ -609,7 +659,31 @@
           <w:u w:val="single"/>
           <w:lang w:eastAsia="es-CO"/>
         </w:rPr>
-        <w:t>{{fuente_escogida}}</w:t>
+        <w:t>{{</w:t>
+      </w:r>
+      <w:proofErr w:type="spellStart"/>
+      <w:r>
+        <w:rPr>
+          <w:rFonts w:ascii="Arial Narrow" w:hAnsi="Arial Narrow" w:cs="Arial"/>
+          <w:b/>
+          <w:bCs/>
+          <w:color w:val="000000"/>
+          <w:u w:val="single"/>
+          <w:lang w:eastAsia="es-CO"/>
+        </w:rPr>
+        <w:t>fuente_escogida</w:t>
+      </w:r>
+      <w:proofErr w:type="spellEnd"/>
+      <w:r>
+        <w:rPr>
+          <w:rFonts w:ascii="Arial Narrow" w:hAnsi="Arial Narrow" w:cs="Arial"/>
+          <w:b/>
+          <w:bCs/>
+          <w:color w:val="000000"/>
+          <w:u w:val="single"/>
+          <w:lang w:eastAsia="es-CO"/>
+        </w:rPr>
+        <w:t>}}</w:t>
       </w:r>
       <w:r>
         <w:rPr>
@@ -691,7 +765,7 @@
           <w:szCs w:val="24"/>
           <w:bdr w:val="none" w:sz="0" w:space="0" w:color="auto" w:frame="1"/>
         </w:rPr>
-        <w:t>Mediante el Decreto 32 de 2023 se reglamentó el PUAP (Programa Único de Acceso y Permanencia - PUAP).</w:t>
+        <w:t>Mediante el Decreto 032 de 2023 se reglamentó el PUAP (Programa Único de Acceso y Permanencia - PUAP).</w:t>
       </w:r>
     </w:p>
     <w:p>
@@ -772,39 +846,7 @@
           <w:sz w:val="24"/>
           <w:szCs w:val="24"/>
         </w:rPr>
-        <w:t xml:space="preserve">Mediante la Resolución </w:t>
-      </w:r>
-      <w:r>
-        <w:rPr>
-          <w:rFonts w:ascii="Arial Narrow" w:hAnsi="Arial Narrow" w:cs="Arial"/>
-          <w:sz w:val="24"/>
-          <w:szCs w:val="24"/>
-        </w:rPr>
-        <w:t xml:space="preserve">1737 </w:t>
-      </w:r>
-      <w:r>
-        <w:rPr>
-          <w:rFonts w:ascii="Arial Narrow" w:hAnsi="Arial Narrow" w:cs="Arial"/>
-          <w:sz w:val="24"/>
-          <w:szCs w:val="24"/>
-        </w:rPr>
-        <w:t>de 202</w:t>
-      </w:r>
-      <w:r>
-        <w:rPr>
-          <w:rFonts w:ascii="Arial Narrow" w:hAnsi="Arial Narrow" w:cs="Arial"/>
-          <w:sz w:val="24"/>
-          <w:szCs w:val="24"/>
-        </w:rPr>
-        <w:t>6</w:t>
-      </w:r>
-      <w:r>
-        <w:rPr>
-          <w:rFonts w:ascii="Arial Narrow" w:hAnsi="Arial Narrow" w:cs="Arial"/>
-          <w:sz w:val="24"/>
-          <w:szCs w:val="24"/>
-        </w:rPr>
-        <w:t>, “</w:t>
+        <w:t>Mediante la Resolución 1737 de 2026, “</w:t>
       </w:r>
       <w:r>
         <w:rPr>
@@ -813,8 +855,9 @@
           <w:sz w:val="24"/>
           <w:szCs w:val="24"/>
         </w:rPr>
-        <w:t xml:space="preserve">Por medio de la cual se realiza la apertura de convocatoria para la línea de crédito condonable pregrado del Programa Único de Acceso y Permanencia en la educación postsecundaria - PUAP, convocatoria </w:t>
-      </w:r>
+        <w:t xml:space="preserve">Por medio de la cual se realiza la apertura de convocatoria para la línea de crédito </w:t>
+      </w:r>
+      <w:proofErr w:type="spellStart"/>
       <w:r>
         <w:rPr>
           <w:rFonts w:ascii="Arial Narrow" w:hAnsi="Arial Narrow" w:cs="Arial"/>
@@ -822,8 +865,9 @@
           <w:sz w:val="24"/>
           <w:szCs w:val="24"/>
         </w:rPr>
-        <w:t>2026-</w:t>
-      </w:r>
+        <w:t>condonable</w:t>
+      </w:r>
+      <w:proofErr w:type="spellEnd"/>
       <w:r>
         <w:rPr>
           <w:rFonts w:ascii="Arial Narrow" w:hAnsi="Arial Narrow" w:cs="Arial"/>
@@ -831,16 +875,7 @@
           <w:sz w:val="24"/>
           <w:szCs w:val="24"/>
         </w:rPr>
-        <w:t>2</w:t>
-      </w:r>
-      <w:r>
-        <w:rPr>
-          <w:rFonts w:ascii="Arial Narrow" w:hAnsi="Arial Narrow" w:cs="Arial"/>
-          <w:i/>
-          <w:sz w:val="24"/>
-          <w:szCs w:val="24"/>
-        </w:rPr>
-        <w:t>”.</w:t>
+        <w:t xml:space="preserve"> pregrado del Programa Único de Acceso y Permanencia en la Educación Postsecundaria - PUAP, convocatoria 2026-2”.</w:t>
       </w:r>
     </w:p>
     <w:p>
@@ -877,39 +912,7 @@
           <w:sz w:val="24"/>
           <w:szCs w:val="24"/>
         </w:rPr>
-        <w:t xml:space="preserve">Mediante la Resolución </w:t>
-      </w:r>
-      <w:r>
-        <w:rPr>
-          <w:rFonts w:ascii="Arial Narrow" w:hAnsi="Arial Narrow" w:cs="Arial"/>
-          <w:sz w:val="24"/>
-          <w:szCs w:val="24"/>
-        </w:rPr>
-        <w:t>3106</w:t>
-      </w:r>
-      <w:r>
-        <w:rPr>
-          <w:rFonts w:ascii="Arial Narrow" w:hAnsi="Arial Narrow" w:cs="Arial"/>
-          <w:sz w:val="24"/>
-          <w:szCs w:val="24"/>
-        </w:rPr>
-        <w:t xml:space="preserve"> de 202</w:t>
-      </w:r>
-      <w:r>
-        <w:rPr>
-          <w:rFonts w:ascii="Arial Narrow" w:hAnsi="Arial Narrow" w:cs="Arial"/>
-          <w:sz w:val="24"/>
-          <w:szCs w:val="24"/>
-        </w:rPr>
-        <w:t>6</w:t>
-      </w:r>
-      <w:r>
-        <w:rPr>
-          <w:rFonts w:ascii="Arial Narrow" w:hAnsi="Arial Narrow" w:cs="Arial"/>
-          <w:sz w:val="24"/>
-          <w:szCs w:val="24"/>
-        </w:rPr>
-        <w:t>, “</w:t>
+        <w:t>Mediante la Resolución 3106 de 2026, “</w:t>
       </w:r>
       <w:r>
         <w:rPr>
@@ -918,8 +921,9 @@
           <w:sz w:val="24"/>
           <w:szCs w:val="24"/>
         </w:rPr>
-        <w:t xml:space="preserve">Por medio de la cual se establecen los puntos de corte, para la línea de créditos condonables pregrado del Programa Único de Acceso y Permanencia en la educación postsecundaria - PUAP, convocatoria </w:t>
-      </w:r>
+        <w:t xml:space="preserve">Por medio de la cual se establecen los puntos de corte y se determinan los aspirantes preseleccionados para la línea de créditos </w:t>
+      </w:r>
+      <w:proofErr w:type="spellStart"/>
       <w:r>
         <w:rPr>
           <w:rFonts w:ascii="Arial Narrow" w:hAnsi="Arial Narrow" w:cs="Arial"/>
@@ -927,8 +931,9 @@
           <w:sz w:val="24"/>
           <w:szCs w:val="24"/>
         </w:rPr>
-        <w:t>2026-</w:t>
-      </w:r>
+        <w:t>condonables</w:t>
+      </w:r>
+      <w:proofErr w:type="spellEnd"/>
       <w:r>
         <w:rPr>
           <w:rFonts w:ascii="Arial Narrow" w:hAnsi="Arial Narrow" w:cs="Arial"/>
@@ -936,23 +941,14 @@
           <w:sz w:val="24"/>
           <w:szCs w:val="24"/>
         </w:rPr>
-        <w:t>2</w:t>
-      </w:r>
-      <w:r>
-        <w:rPr>
-          <w:rFonts w:ascii="Arial Narrow" w:hAnsi="Arial Narrow" w:cs="Arial"/>
-          <w:i/>
+        <w:t xml:space="preserve"> de pregrado del Programa Único de Acceso y Permanencia en la Educación Postsecundaria - PUAP, convocatoria 2026-2”</w:t>
+      </w:r>
+      <w:r>
+        <w:rPr>
+          <w:rFonts w:ascii="Arial Narrow" w:hAnsi="Arial Narrow" w:cs="Arial"/>
           <w:sz w:val="24"/>
           <w:szCs w:val="24"/>
         </w:rPr>
-        <w:t>”</w:t>
-      </w:r>
-      <w:r>
-        <w:rPr>
-          <w:rFonts w:ascii="Arial Narrow" w:hAnsi="Arial Narrow" w:cs="Arial"/>
-          <w:sz w:val="24"/>
-          <w:szCs w:val="24"/>
-        </w:rPr>
         <w:t>.</w:t>
       </w:r>
     </w:p>
@@ -972,7 +968,40 @@
           <w:color w:val="000000"/>
           <w:bdr w:val="none" w:sz="0" w:space="0" w:color="auto" w:frame="1"/>
         </w:rPr>
-        <w:t>Hechas las precisiones anteriores, se procede a revisar y a brindar respuesta a la petición en cuestión en los siguientes términos, Artículo 71 del Decreto 032 de 2023:</w:t>
+        <w:lastRenderedPageBreak/>
+        <w:t xml:space="preserve">Hechas las precisiones anteriores, se procede a revisar y a brindar respuesta a la petición en cuestión en los siguientes términos, </w:t>
+      </w:r>
+      <w:r>
+        <w:rPr>
+          <w:rFonts w:ascii="Arial Narrow" w:hAnsi="Arial Narrow" w:cs="Arial"/>
+          <w:color w:val="000000"/>
+          <w:bdr w:val="none" w:sz="0" w:space="0" w:color="auto" w:frame="1"/>
+        </w:rPr>
+        <w:t>descritos en el literal a) del a</w:t>
+      </w:r>
+      <w:r>
+        <w:rPr>
+          <w:rFonts w:ascii="Arial Narrow" w:hAnsi="Arial Narrow" w:cs="Arial"/>
+          <w:color w:val="000000"/>
+          <w:bdr w:val="none" w:sz="0" w:space="0" w:color="auto" w:frame="1"/>
+        </w:rPr>
+        <w:t>rtículo 71 del Decreto 032 de 2023</w:t>
+      </w:r>
+      <w:r>
+        <w:rPr>
+          <w:rFonts w:ascii="Arial Narrow" w:hAnsi="Arial Narrow" w:cs="Arial"/>
+          <w:color w:val="000000"/>
+          <w:bdr w:val="none" w:sz="0" w:space="0" w:color="auto" w:frame="1"/>
+        </w:rPr>
+        <w:t xml:space="preserve"> y el parágrafo adicionado en el artículo 37 del Decreto 0344 de 2025, el cual prevé lo siguiente</w:t>
+      </w:r>
+      <w:r>
+        <w:rPr>
+          <w:rFonts w:ascii="Arial Narrow" w:hAnsi="Arial Narrow" w:cs="Arial"/>
+          <w:color w:val="000000"/>
+          <w:bdr w:val="none" w:sz="0" w:space="0" w:color="auto" w:frame="1"/>
+        </w:rPr>
+        <w:t>:</w:t>
       </w:r>
     </w:p>
     <w:p>
@@ -992,7 +1021,6 @@
           <w:bCs/>
           <w:i/>
         </w:rPr>
-        <w:lastRenderedPageBreak/>
         <w:t xml:space="preserve">Artículo 71. </w:t>
       </w:r>
       <w:r>
@@ -1064,15 +1092,8 @@
     <w:p>
       <w:pPr>
         <w:pStyle w:val="Default"/>
-        <w:ind w:left="1068"/>
-        <w:jc w:val="both"/>
-        <w:rPr>
-          <w:rFonts w:ascii="Arial Narrow" w:hAnsi="Arial Narrow"/>
-          <w:i/>
-          <w:iCs/>
-        </w:rPr>
-      </w:pPr>
-      <w:r>
+        <w:ind w:left="708"/>
+        <w:jc w:val="both"/>
         <w:rPr>
           <w:rFonts w:ascii="Arial Narrow" w:hAnsi="Arial Narrow"/>
           <w:b/>
@@ -1080,16 +1101,7 @@
           <w:i/>
           <w:iCs/>
         </w:rPr>
-        <w:t xml:space="preserve">Artículo 36. </w:t>
-      </w:r>
-      <w:r>
-        <w:rPr>
-          <w:rFonts w:ascii="Arial Narrow" w:hAnsi="Arial Narrow"/>
-          <w:i/>
-          <w:iCs/>
-        </w:rPr>
-        <w:t xml:space="preserve">Adicionar un parágrafo al </w:t>
-      </w:r>
+      </w:pPr>
       <w:r>
         <w:rPr>
           <w:rFonts w:ascii="Arial Narrow" w:hAnsi="Arial Narrow"/>
@@ -1098,7 +1110,7 @@
           <w:i/>
           <w:iCs/>
         </w:rPr>
-        <w:t xml:space="preserve">artículo 70 </w:t>
+        <w:t xml:space="preserve">Artículo 37. </w:t>
       </w:r>
       <w:r>
         <w:rPr>
@@ -1106,101 +1118,13 @@
           <w:i/>
           <w:iCs/>
         </w:rPr>
-        <w:t xml:space="preserve">del Título </w:t>
-      </w:r>
-      <w:r>
-        <w:rPr>
-          <w:rFonts w:ascii="Arial Narrow" w:hAnsi="Arial Narrow"/>
-          <w:i/>
-          <w:iCs/>
-        </w:rPr>
-        <w:t>III</w:t>
-      </w:r>
-      <w:r>
-        <w:rPr>
-          <w:rFonts w:ascii="Arial Narrow" w:hAnsi="Arial Narrow"/>
-          <w:i/>
-          <w:iCs/>
-        </w:rPr>
-        <w:t>: Línea Créditos</w:t>
-      </w:r>
-      <w:r>
-        <w:rPr>
-          <w:rFonts w:ascii="Arial Narrow" w:hAnsi="Arial Narrow"/>
-          <w:i/>
-          <w:iCs/>
-        </w:rPr>
-        <w:t xml:space="preserve"> </w:t>
-      </w:r>
-      <w:r>
-        <w:rPr>
-          <w:rFonts w:ascii="Arial Narrow" w:hAnsi="Arial Narrow"/>
-          <w:i/>
-          <w:iCs/>
-        </w:rPr>
-        <w:t>Cond</w:t>
-      </w:r>
-      <w:r>
-        <w:rPr>
-          <w:rFonts w:ascii="Arial Narrow" w:hAnsi="Arial Narrow"/>
-          <w:i/>
-          <w:iCs/>
-        </w:rPr>
-        <w:t>o</w:t>
-      </w:r>
-      <w:r>
-        <w:rPr>
-          <w:rFonts w:ascii="Arial Narrow" w:hAnsi="Arial Narrow"/>
-          <w:i/>
-          <w:iCs/>
-        </w:rPr>
-        <w:t xml:space="preserve">nables, Capítulo </w:t>
-      </w:r>
-      <w:r>
-        <w:rPr>
-          <w:rFonts w:ascii="Arial Narrow" w:hAnsi="Arial Narrow"/>
-          <w:i/>
-          <w:iCs/>
-        </w:rPr>
-        <w:t>I</w:t>
-      </w:r>
-      <w:r>
-        <w:rPr>
-          <w:rFonts w:ascii="Arial Narrow" w:hAnsi="Arial Narrow"/>
-          <w:i/>
-          <w:iCs/>
-        </w:rPr>
-        <w:t>: Créditos Cond</w:t>
-      </w:r>
-      <w:r>
-        <w:rPr>
-          <w:rFonts w:ascii="Arial Narrow" w:hAnsi="Arial Narrow"/>
-          <w:i/>
-          <w:iCs/>
-        </w:rPr>
-        <w:t>o</w:t>
-      </w:r>
-      <w:r>
-        <w:rPr>
-          <w:rFonts w:ascii="Arial Narrow" w:hAnsi="Arial Narrow"/>
-          <w:i/>
-          <w:iCs/>
-        </w:rPr>
-        <w:t>nables del Decreto 032 de 2023, el cual</w:t>
-      </w:r>
-      <w:r>
-        <w:rPr>
-          <w:rFonts w:ascii="Arial Narrow" w:hAnsi="Arial Narrow"/>
-          <w:i/>
-          <w:iCs/>
-        </w:rPr>
-        <w:t xml:space="preserve"> quedará así:</w:t>
+        <w:t>Adicionar un parágrafo al artículo 71 del Título III: Línea Créditos Condenables, Capítulo I: Créditos Condenables del Decreto 032 de 2023, el cual quedará así:</w:t>
       </w:r>
     </w:p>
     <w:p>
       <w:pPr>
         <w:pStyle w:val="Default"/>
-        <w:ind w:left="1068"/>
+        <w:ind w:left="708"/>
         <w:jc w:val="both"/>
         <w:rPr>
           <w:rFonts w:ascii="Arial Narrow" w:hAnsi="Arial Narrow"/>
@@ -1210,7 +1134,7 @@
     <w:p>
       <w:pPr>
         <w:pStyle w:val="Default"/>
-        <w:ind w:left="1068"/>
+        <w:ind w:left="708"/>
         <w:jc w:val="both"/>
         <w:rPr>
           <w:rFonts w:ascii="Arial Narrow" w:hAnsi="Arial Narrow"/>
@@ -1226,239 +1150,7 @@
           <w:i/>
           <w:iCs/>
         </w:rPr>
-        <w:t xml:space="preserve">Parágrafo 3. </w:t>
-      </w:r>
-      <w:r>
-        <w:rPr>
-          <w:rFonts w:ascii="Arial Narrow" w:hAnsi="Arial Narrow"/>
-          <w:i/>
-          <w:iCs/>
-        </w:rPr>
-        <w:t>Lo dispuesto en el literal f) no le será aplicable a los beneficiarios</w:t>
-      </w:r>
-      <w:r>
-        <w:rPr>
-          <w:rFonts w:ascii="Arial Narrow" w:hAnsi="Arial Narrow"/>
-          <w:i/>
-          <w:iCs/>
-        </w:rPr>
-        <w:t xml:space="preserve"> </w:t>
-      </w:r>
-      <w:r>
-        <w:rPr>
-          <w:rFonts w:ascii="Arial Narrow" w:hAnsi="Arial Narrow"/>
-          <w:i/>
-          <w:iCs/>
-        </w:rPr>
-        <w:t>de Matrícula Cero, que aspiren a la Línea de crédito cond</w:t>
-      </w:r>
-      <w:r>
-        <w:rPr>
-          <w:rFonts w:ascii="Arial Narrow" w:hAnsi="Arial Narrow"/>
-          <w:i/>
-          <w:iCs/>
-        </w:rPr>
-        <w:t>o</w:t>
-      </w:r>
-      <w:r>
-        <w:rPr>
-          <w:rFonts w:ascii="Arial Narrow" w:hAnsi="Arial Narrow"/>
-          <w:i/>
-          <w:iCs/>
-        </w:rPr>
-        <w:t>nable en la</w:t>
-      </w:r>
-      <w:r>
-        <w:rPr>
-          <w:rFonts w:ascii="Arial Narrow" w:hAnsi="Arial Narrow"/>
-          <w:i/>
-          <w:iCs/>
-        </w:rPr>
-        <w:t xml:space="preserve"> modalidad de sostenimiento.</w:t>
-      </w:r>
-    </w:p>
-    <w:p>
-      <w:pPr>
-        <w:pStyle w:val="Default"/>
-        <w:ind w:left="1068"/>
-        <w:jc w:val="both"/>
-        <w:rPr>
-          <w:rFonts w:ascii="Arial Narrow" w:hAnsi="Arial Narrow"/>
-        </w:rPr>
-      </w:pPr>
-    </w:p>
-    <w:p>
-      <w:pPr>
-        <w:pStyle w:val="Default"/>
-        <w:jc w:val="both"/>
-        <w:rPr>
-          <w:rFonts w:ascii="Arial Narrow" w:hAnsi="Arial Narrow"/>
-        </w:rPr>
-      </w:pPr>
-      <w:r>
-        <w:rPr>
-          <w:rFonts w:ascii="Arial Narrow" w:hAnsi="Arial Narrow"/>
-          <w:bdr w:val="none" w:sz="0" w:space="0" w:color="auto" w:frame="1"/>
-        </w:rPr>
-        <w:t>Este impedimento surgió dado que, en</w:t>
-      </w:r>
-      <w:r>
-        <w:rPr>
-          <w:rFonts w:ascii="Arial Narrow" w:hAnsi="Arial Narrow"/>
-          <w:bdr w:val="none" w:sz="0" w:space="0" w:color="auto" w:frame="1"/>
-        </w:rPr>
-        <w:t xml:space="preserve"> el formulario de inscripción el</w:t>
-      </w:r>
-      <w:r>
-        <w:rPr>
-          <w:rFonts w:ascii="Arial Narrow" w:hAnsi="Arial Narrow"/>
-          <w:bdr w:val="none" w:sz="0" w:space="0" w:color="auto" w:frame="1"/>
-        </w:rPr>
-        <w:t xml:space="preserve"> cand</w:t>
-      </w:r>
-      <w:r>
-        <w:rPr>
-          <w:rFonts w:ascii="Arial Narrow" w:hAnsi="Arial Narrow"/>
-          <w:bdr w:val="none" w:sz="0" w:space="0" w:color="auto" w:frame="1"/>
-        </w:rPr>
-        <w:t>idato</w:t>
-      </w:r>
-      <w:r>
-        <w:rPr>
-          <w:rFonts w:ascii="Arial Narrow" w:hAnsi="Arial Narrow"/>
-          <w:bdr w:val="none" w:sz="0" w:space="0" w:color="auto" w:frame="1"/>
-        </w:rPr>
-        <w:t xml:space="preserve"> en la</w:t>
-      </w:r>
-      <w:r>
-        <w:rPr>
-          <w:rFonts w:ascii="Arial Narrow" w:hAnsi="Arial Narrow"/>
-          <w:bdr w:val="none" w:sz="0" w:space="0" w:color="auto" w:frame="1"/>
-        </w:rPr>
-        <w:t>s</w:t>
-      </w:r>
-      <w:r>
-        <w:rPr>
-          <w:rFonts w:ascii="Arial Narrow" w:hAnsi="Arial Narrow"/>
-          <w:bdr w:val="none" w:sz="0" w:space="0" w:color="auto" w:frame="1"/>
-        </w:rPr>
-        <w:t xml:space="preserve"> pregunta</w:t>
-      </w:r>
-      <w:r>
-        <w:rPr>
-          <w:rFonts w:ascii="Arial Narrow" w:hAnsi="Arial Narrow"/>
-          <w:bdr w:val="none" w:sz="0" w:space="0" w:color="auto" w:frame="1"/>
-        </w:rPr>
-        <w:t>s</w:t>
-      </w:r>
-      <w:r>
-        <w:rPr>
-          <w:rFonts w:ascii="Arial Narrow" w:hAnsi="Arial Narrow"/>
-          <w:bdr w:val="none" w:sz="0" w:space="0" w:color="auto" w:frame="1"/>
-        </w:rPr>
-        <w:t xml:space="preserve"> </w:t>
-      </w:r>
-      <w:r>
-        <w:rPr>
-          <w:rFonts w:ascii="Arial Narrow" w:hAnsi="Arial Narrow"/>
-          <w:b/>
-          <w:i/>
-          <w:bdr w:val="none" w:sz="0" w:space="0" w:color="auto" w:frame="1"/>
-        </w:rPr>
-        <w:t xml:space="preserve">¿Posee título </w:t>
-      </w:r>
-      <w:r>
-        <w:rPr>
-          <w:rFonts w:ascii="Arial Narrow" w:hAnsi="Arial Narrow"/>
-          <w:b/>
-          <w:bCs/>
-          <w:i/>
-        </w:rPr>
-        <w:t>técnico profesional</w:t>
-      </w:r>
-      <w:r>
-        <w:rPr>
-          <w:rFonts w:ascii="Arial Narrow" w:hAnsi="Arial Narrow"/>
-          <w:b/>
-          <w:i/>
-          <w:bdr w:val="none" w:sz="0" w:space="0" w:color="auto" w:frame="1"/>
-        </w:rPr>
-        <w:t xml:space="preserve">?, </w:t>
-      </w:r>
-      <w:r>
-        <w:rPr>
-          <w:rFonts w:ascii="Arial Narrow" w:hAnsi="Arial Narrow"/>
-          <w:b/>
-          <w:i/>
-          <w:bdr w:val="none" w:sz="0" w:space="0" w:color="auto" w:frame="1"/>
-        </w:rPr>
-        <w:t>¿Posee título tecnólogo?</w:t>
-      </w:r>
-      <w:r>
-        <w:rPr>
-          <w:rFonts w:ascii="Arial Narrow" w:hAnsi="Arial Narrow"/>
-          <w:b/>
-          <w:bCs/>
-          <w:i/>
-        </w:rPr>
-        <w:t xml:space="preserve"> </w:t>
-      </w:r>
-      <w:r>
-        <w:rPr>
-          <w:rFonts w:ascii="Arial Narrow" w:hAnsi="Arial Narrow"/>
-          <w:bCs/>
-          <w:i/>
-        </w:rPr>
-        <w:t>o</w:t>
-      </w:r>
-      <w:r>
-        <w:rPr>
-          <w:rFonts w:ascii="Arial Narrow" w:hAnsi="Arial Narrow"/>
-          <w:b/>
-          <w:bCs/>
-          <w:i/>
-        </w:rPr>
-        <w:t xml:space="preserve"> </w:t>
-      </w:r>
-      <w:r>
-        <w:rPr>
-          <w:rFonts w:ascii="Arial Narrow" w:hAnsi="Arial Narrow"/>
-          <w:b/>
-          <w:bCs/>
-          <w:i/>
-        </w:rPr>
-        <w:t xml:space="preserve">¿Posee título </w:t>
-      </w:r>
-      <w:r>
-        <w:rPr>
-          <w:rFonts w:ascii="Arial Narrow" w:hAnsi="Arial Narrow"/>
-          <w:b/>
-          <w:bCs/>
-          <w:i/>
-        </w:rPr>
-        <w:t>técnico profesional</w:t>
-      </w:r>
-      <w:r>
-        <w:rPr>
-          <w:rFonts w:ascii="Arial Narrow" w:hAnsi="Arial Narrow"/>
-          <w:b/>
-          <w:bCs/>
-          <w:i/>
-        </w:rPr>
-        <w:t>?</w:t>
-      </w:r>
-      <w:r>
-        <w:rPr>
-          <w:rFonts w:ascii="Arial Narrow" w:hAnsi="Arial Narrow"/>
-          <w:i/>
-        </w:rPr>
-        <w:t>, r</w:t>
-      </w:r>
-      <w:r>
-        <w:rPr>
-          <w:rFonts w:ascii="Arial Narrow" w:hAnsi="Arial Narrow"/>
-        </w:rPr>
-        <w:t xml:space="preserve">esponde de forma afirmativa y en la pregunta </w:t>
+        <w:t>Parágrafo</w:t>
       </w:r>
       <w:r>
         <w:rPr>
@@ -1468,134 +1160,378 @@
           <w:i/>
           <w:iCs/>
         </w:rPr>
-        <w:t>¿Continuará sus estudios bajo la modalidad de ciclos propedéuticos u homologación?</w:t>
-      </w:r>
-      <w:r>
-        <w:rPr>
-          <w:rFonts w:ascii="Arial Narrow" w:hAnsi="Arial Narrow"/>
-        </w:rPr>
-        <w:t>, responde de forma negativa, como se muestra a continuación:</w:t>
-      </w:r>
-    </w:p>
-    <w:p>
-      <w:pPr>
-        <w:pStyle w:val="Default"/>
-        <w:jc w:val="both"/>
-        <w:rPr>
-          <w:rFonts w:ascii="Arial Narrow" w:hAnsi="Arial Narrow"/>
-        </w:rPr>
-      </w:pPr>
-    </w:p>
-    <w:p>
-      <w:pPr>
-        <w:pStyle w:val="Default"/>
-        <w:jc w:val="center"/>
-        <w:rPr>
-          <w:rFonts w:ascii="Arial Narrow" w:hAnsi="Arial Narrow"/>
-        </w:rPr>
-      </w:pPr>
-      <w:r>
-        <w:rPr>
-          <w:rFonts w:ascii="Arial Narrow" w:hAnsi="Arial Narrow"/>
-        </w:rPr>
-        <w:t>{{imagen1}}</w:t>
-      </w:r>
-    </w:p>
-    <w:p>
-      <w:pPr>
-        <w:jc w:val="both"/>
-        <w:rPr>
-          <w:rFonts w:ascii="Arial Narrow" w:hAnsi="Arial Narrow" w:cs="Arial"/>
-          <w:bdr w:val="none" w:sz="0" w:space="0" w:color="auto" w:frame="1"/>
-        </w:rPr>
-      </w:pPr>
-    </w:p>
-    <w:p>
-      <w:pPr>
-        <w:jc w:val="both"/>
-        <w:rPr>
-          <w:rFonts w:ascii="Arial Narrow" w:hAnsi="Arial Narrow" w:cs="Arial"/>
-          <w:bdr w:val="none" w:sz="0" w:space="0" w:color="auto" w:frame="1"/>
-        </w:rPr>
-      </w:pPr>
-      <w:r>
-        <w:rPr>
-          <w:rFonts w:ascii="Arial Narrow" w:hAnsi="Arial Narrow" w:cs="Arial"/>
-          <w:bdr w:val="none" w:sz="0" w:space="0" w:color="auto" w:frame="1"/>
-        </w:rPr>
-        <w:t xml:space="preserve">De manera que, otorgar una respuesta </w:t>
-      </w:r>
-      <w:r>
-        <w:rPr>
-          <w:rFonts w:ascii="Arial Narrow" w:hAnsi="Arial Narrow" w:cs="Arial"/>
-          <w:bdr w:val="none" w:sz="0" w:space="0" w:color="auto" w:frame="1"/>
-        </w:rPr>
-        <w:t>afirmativa</w:t>
-      </w:r>
-      <w:r>
-        <w:rPr>
-          <w:rFonts w:ascii="Arial Narrow" w:hAnsi="Arial Narrow" w:cs="Arial"/>
-          <w:bdr w:val="none" w:sz="0" w:space="0" w:color="auto" w:frame="1"/>
-        </w:rPr>
-        <w:t xml:space="preserve"> </w:t>
-      </w:r>
-      <w:r>
-        <w:rPr>
-          <w:rFonts w:ascii="Arial Narrow" w:hAnsi="Arial Narrow"/>
-          <w:b/>
-          <w:bCs/>
-          <w:i/>
-        </w:rPr>
-        <w:t xml:space="preserve">a </w:t>
-      </w:r>
-      <w:r>
-        <w:rPr>
-          <w:rFonts w:ascii="Arial Narrow" w:hAnsi="Arial Narrow"/>
-          <w:b/>
-          <w:bCs/>
-        </w:rPr>
-        <w:t>una o varias de las preguntas planteadas anteriormente</w:t>
-      </w:r>
-      <w:r>
-        <w:rPr>
-          <w:rFonts w:ascii="Arial Narrow" w:hAnsi="Arial Narrow" w:cs="Arial"/>
-          <w:bCs/>
-        </w:rPr>
-        <w:t>,</w:t>
-      </w:r>
-      <w:r>
-        <w:rPr>
-          <w:rFonts w:ascii="Arial Narrow" w:hAnsi="Arial Narrow" w:cs="Arial"/>
-          <w:b/>
-          <w:bCs/>
-          <w:i/>
-        </w:rPr>
-        <w:t xml:space="preserve"> </w:t>
-      </w:r>
-      <w:r>
-        <w:rPr>
-          <w:rFonts w:ascii="Arial Narrow" w:hAnsi="Arial Narrow" w:cs="Arial"/>
-          <w:bCs/>
-        </w:rPr>
-        <w:t>y responder de forma negativa a la pregunta</w:t>
-      </w:r>
-      <w:r>
-        <w:rPr>
-          <w:rFonts w:ascii="Arial Narrow" w:hAnsi="Arial Narrow" w:cs="Arial"/>
-          <w:b/>
-          <w:bCs/>
-          <w:i/>
-        </w:rPr>
-        <w:t xml:space="preserve"> </w:t>
-      </w:r>
-      <w:r>
-        <w:rPr>
-          <w:rFonts w:ascii="Arial Narrow" w:hAnsi="Arial Narrow" w:cs="Arial"/>
+        <w:t>:</w:t>
+      </w:r>
+      <w:r>
+        <w:rPr>
+          <w:rFonts w:ascii="Arial Narrow" w:hAnsi="Arial Narrow"/>
           <w:b/>
           <w:bCs/>
           <w:i/>
           <w:iCs/>
         </w:rPr>
+        <w:t xml:space="preserve"> </w:t>
+      </w:r>
+      <w:r>
+        <w:rPr>
+          <w:rFonts w:ascii="Arial Narrow" w:hAnsi="Arial Narrow"/>
+          <w:i/>
+          <w:iCs/>
+        </w:rPr>
+        <w:t>Quienes de conformidad con los reglamentos anteriores</w:t>
+      </w:r>
+      <w:r>
+        <w:rPr>
+          <w:rFonts w:ascii="Arial Narrow" w:hAnsi="Arial Narrow"/>
+          <w:i/>
+          <w:iCs/>
+        </w:rPr>
+        <w:t xml:space="preserve"> </w:t>
+      </w:r>
+      <w:r>
+        <w:rPr>
+          <w:rFonts w:ascii="Arial Narrow" w:hAnsi="Arial Narrow"/>
+          <w:i/>
+          <w:iCs/>
+        </w:rPr>
+        <w:t>ingresaron al crédito condenable en la modalidad de matrícula, podrán</w:t>
+      </w:r>
+      <w:r>
+        <w:rPr>
+          <w:rFonts w:ascii="Arial Narrow" w:hAnsi="Arial Narrow"/>
+          <w:i/>
+          <w:iCs/>
+        </w:rPr>
+        <w:t xml:space="preserve"> </w:t>
+      </w:r>
+      <w:r>
+        <w:rPr>
+          <w:rFonts w:ascii="Arial Narrow" w:hAnsi="Arial Narrow"/>
+          <w:i/>
+          <w:iCs/>
+        </w:rPr>
+        <w:t>acceder a la modalidad de sostenimiento dentro del PUAP.</w:t>
+      </w:r>
+    </w:p>
+    <w:p>
+      <w:pPr>
+        <w:pStyle w:val="Default"/>
+        <w:ind w:left="1068"/>
+        <w:jc w:val="both"/>
+        <w:rPr>
+          <w:rFonts w:ascii="Arial Narrow" w:hAnsi="Arial Narrow"/>
+        </w:rPr>
+      </w:pPr>
+    </w:p>
+    <w:p>
+      <w:pPr>
+        <w:pStyle w:val="Default"/>
+        <w:jc w:val="both"/>
+        <w:rPr>
+          <w:rFonts w:ascii="Arial Narrow" w:hAnsi="Arial Narrow"/>
+        </w:rPr>
+      </w:pPr>
+      <w:r>
+        <w:rPr>
+          <w:rFonts w:ascii="Arial Narrow" w:hAnsi="Arial Narrow"/>
+          <w:bdr w:val="none" w:sz="0" w:space="0" w:color="auto" w:frame="1"/>
+        </w:rPr>
+        <w:t>Este impedimento surgió dado que, en</w:t>
+      </w:r>
+      <w:r>
+        <w:rPr>
+          <w:rFonts w:ascii="Arial Narrow" w:hAnsi="Arial Narrow"/>
+          <w:bdr w:val="none" w:sz="0" w:space="0" w:color="auto" w:frame="1"/>
+        </w:rPr>
+        <w:t xml:space="preserve"> el formulario de inscripción el</w:t>
+      </w:r>
+      <w:r>
+        <w:rPr>
+          <w:rFonts w:ascii="Arial Narrow" w:hAnsi="Arial Narrow"/>
+          <w:bdr w:val="none" w:sz="0" w:space="0" w:color="auto" w:frame="1"/>
+        </w:rPr>
+        <w:t xml:space="preserve"> cand</w:t>
+      </w:r>
+      <w:r>
+        <w:rPr>
+          <w:rFonts w:ascii="Arial Narrow" w:hAnsi="Arial Narrow"/>
+          <w:bdr w:val="none" w:sz="0" w:space="0" w:color="auto" w:frame="1"/>
+        </w:rPr>
+        <w:t>idato</w:t>
+      </w:r>
+      <w:r>
+        <w:rPr>
+          <w:rFonts w:ascii="Arial Narrow" w:hAnsi="Arial Narrow"/>
+          <w:bdr w:val="none" w:sz="0" w:space="0" w:color="auto" w:frame="1"/>
+        </w:rPr>
+        <w:t xml:space="preserve"> en la</w:t>
+      </w:r>
+      <w:r>
+        <w:rPr>
+          <w:rFonts w:ascii="Arial Narrow" w:hAnsi="Arial Narrow"/>
+          <w:bdr w:val="none" w:sz="0" w:space="0" w:color="auto" w:frame="1"/>
+        </w:rPr>
+        <w:t>s</w:t>
+      </w:r>
+      <w:r>
+        <w:rPr>
+          <w:rFonts w:ascii="Arial Narrow" w:hAnsi="Arial Narrow"/>
+          <w:bdr w:val="none" w:sz="0" w:space="0" w:color="auto" w:frame="1"/>
+        </w:rPr>
+        <w:t xml:space="preserve"> pregunta</w:t>
+      </w:r>
+      <w:r>
+        <w:rPr>
+          <w:rFonts w:ascii="Arial Narrow" w:hAnsi="Arial Narrow"/>
+          <w:bdr w:val="none" w:sz="0" w:space="0" w:color="auto" w:frame="1"/>
+        </w:rPr>
+        <w:t>s</w:t>
+      </w:r>
+      <w:r>
+        <w:rPr>
+          <w:rFonts w:ascii="Arial Narrow" w:hAnsi="Arial Narrow"/>
+          <w:bdr w:val="none" w:sz="0" w:space="0" w:color="auto" w:frame="1"/>
+        </w:rPr>
+        <w:t xml:space="preserve"> </w:t>
+      </w:r>
+      <w:r>
+        <w:rPr>
+          <w:rFonts w:ascii="Arial Narrow" w:hAnsi="Arial Narrow"/>
+          <w:b/>
+          <w:i/>
+          <w:bdr w:val="none" w:sz="0" w:space="0" w:color="auto" w:frame="1"/>
+        </w:rPr>
+        <w:t xml:space="preserve">¿Posee título </w:t>
+      </w:r>
+      <w:r>
+        <w:rPr>
+          <w:rFonts w:ascii="Arial Narrow" w:hAnsi="Arial Narrow"/>
+          <w:b/>
+          <w:bCs/>
+          <w:i/>
+        </w:rPr>
+        <w:t>técnico profesional</w:t>
+      </w:r>
+      <w:r>
+        <w:rPr>
+          <w:rFonts w:ascii="Arial Narrow" w:hAnsi="Arial Narrow"/>
+          <w:b/>
+          <w:i/>
+          <w:bdr w:val="none" w:sz="0" w:space="0" w:color="auto" w:frame="1"/>
+        </w:rPr>
+        <w:t xml:space="preserve">?, </w:t>
+      </w:r>
+      <w:r>
+        <w:rPr>
+          <w:rFonts w:ascii="Arial Narrow" w:hAnsi="Arial Narrow"/>
+          <w:b/>
+          <w:i/>
+          <w:bdr w:val="none" w:sz="0" w:space="0" w:color="auto" w:frame="1"/>
+        </w:rPr>
+        <w:t>¿Posee título tecnólogo?</w:t>
+      </w:r>
+      <w:r>
+        <w:rPr>
+          <w:rFonts w:ascii="Arial Narrow" w:hAnsi="Arial Narrow"/>
+          <w:b/>
+          <w:bCs/>
+          <w:i/>
+        </w:rPr>
+        <w:t xml:space="preserve"> </w:t>
+      </w:r>
+      <w:r>
+        <w:rPr>
+          <w:rFonts w:ascii="Arial Narrow" w:hAnsi="Arial Narrow"/>
+          <w:bCs/>
+          <w:i/>
+        </w:rPr>
+        <w:t>o</w:t>
+      </w:r>
+      <w:r>
+        <w:rPr>
+          <w:rFonts w:ascii="Arial Narrow" w:hAnsi="Arial Narrow"/>
+          <w:b/>
+          <w:bCs/>
+          <w:i/>
+        </w:rPr>
+        <w:t xml:space="preserve"> </w:t>
+      </w:r>
+      <w:r>
+        <w:rPr>
+          <w:rFonts w:ascii="Arial Narrow" w:hAnsi="Arial Narrow"/>
+          <w:b/>
+          <w:bCs/>
+          <w:i/>
+        </w:rPr>
+        <w:t xml:space="preserve">¿Posee título </w:t>
+      </w:r>
+      <w:r>
+        <w:rPr>
+          <w:rFonts w:ascii="Arial Narrow" w:hAnsi="Arial Narrow"/>
+          <w:b/>
+          <w:bCs/>
+          <w:i/>
+        </w:rPr>
+        <w:t>técnico profesional</w:t>
+      </w:r>
+      <w:r>
+        <w:rPr>
+          <w:rFonts w:ascii="Arial Narrow" w:hAnsi="Arial Narrow"/>
+          <w:b/>
+          <w:bCs/>
+          <w:i/>
+        </w:rPr>
+        <w:t>?</w:t>
+      </w:r>
+      <w:r>
+        <w:rPr>
+          <w:rFonts w:ascii="Arial Narrow" w:hAnsi="Arial Narrow"/>
+          <w:i/>
+        </w:rPr>
+        <w:t>, r</w:t>
+      </w:r>
+      <w:r>
+        <w:rPr>
+          <w:rFonts w:ascii="Arial Narrow" w:hAnsi="Arial Narrow"/>
+        </w:rPr>
+        <w:t xml:space="preserve">esponde de forma afirmativa y en la pregunta </w:t>
+      </w:r>
+      <w:r>
+        <w:rPr>
+          <w:rFonts w:ascii="Arial Narrow" w:hAnsi="Arial Narrow"/>
+          <w:b/>
+          <w:bCs/>
+          <w:i/>
+          <w:iCs/>
+        </w:rPr>
+        <w:t>¿Continuará sus estudios bajo la modalidad de ciclos propedéuticos u homologación?</w:t>
+      </w:r>
+      <w:r>
+        <w:rPr>
+          <w:rFonts w:ascii="Arial Narrow" w:hAnsi="Arial Narrow"/>
+        </w:rPr>
+        <w:t>, responde de forma negativa, como se muestra a continuación:</w:t>
+      </w:r>
+    </w:p>
+    <w:p>
+      <w:pPr>
+        <w:pStyle w:val="Default"/>
+        <w:jc w:val="both"/>
+        <w:rPr>
+          <w:rFonts w:ascii="Arial Narrow" w:hAnsi="Arial Narrow"/>
+        </w:rPr>
+      </w:pPr>
+    </w:p>
+    <w:p>
+      <w:pPr>
+        <w:pStyle w:val="Default"/>
+        <w:jc w:val="center"/>
+        <w:rPr>
+          <w:rFonts w:ascii="Arial Narrow" w:hAnsi="Arial Narrow"/>
+        </w:rPr>
+      </w:pPr>
+      <w:r>
+        <w:rPr>
+          <w:rFonts w:ascii="Arial Narrow" w:hAnsi="Arial Narrow"/>
+        </w:rPr>
+        <w:t>{{imagen1}}</w:t>
+      </w:r>
+    </w:p>
+    <w:p>
+      <w:pPr>
+        <w:jc w:val="both"/>
+        <w:rPr>
+          <w:rFonts w:ascii="Arial Narrow" w:hAnsi="Arial Narrow" w:cs="Arial"/>
+          <w:bdr w:val="none" w:sz="0" w:space="0" w:color="auto" w:frame="1"/>
+        </w:rPr>
+      </w:pPr>
+    </w:p>
+    <w:p>
+      <w:pPr>
+        <w:jc w:val="both"/>
+        <w:rPr>
+          <w:rFonts w:ascii="Arial Narrow" w:hAnsi="Arial Narrow" w:cs="Arial"/>
+          <w:bdr w:val="none" w:sz="0" w:space="0" w:color="auto" w:frame="1"/>
+        </w:rPr>
+      </w:pPr>
+      <w:r>
+        <w:rPr>
+          <w:rFonts w:ascii="Arial Narrow" w:hAnsi="Arial Narrow" w:cs="Arial"/>
+          <w:bdr w:val="none" w:sz="0" w:space="0" w:color="auto" w:frame="1"/>
+        </w:rPr>
+        <w:t xml:space="preserve">De manera que, otorgar una respuesta </w:t>
+      </w:r>
+      <w:r>
+        <w:rPr>
+          <w:rFonts w:ascii="Arial Narrow" w:hAnsi="Arial Narrow" w:cs="Arial"/>
+          <w:bdr w:val="none" w:sz="0" w:space="0" w:color="auto" w:frame="1"/>
+        </w:rPr>
+        <w:t>afirmativa</w:t>
+      </w:r>
+      <w:r>
+        <w:rPr>
+          <w:rFonts w:ascii="Arial Narrow" w:hAnsi="Arial Narrow" w:cs="Arial"/>
+          <w:bdr w:val="none" w:sz="0" w:space="0" w:color="auto" w:frame="1"/>
+        </w:rPr>
+        <w:t xml:space="preserve"> </w:t>
+      </w:r>
+      <w:r>
+        <w:rPr>
+          <w:rFonts w:ascii="Arial Narrow" w:hAnsi="Arial Narrow"/>
+          <w:b/>
+          <w:bCs/>
+          <w:i/>
+        </w:rPr>
+        <w:t xml:space="preserve">a </w:t>
+      </w:r>
+      <w:r>
+        <w:rPr>
+          <w:rFonts w:ascii="Arial Narrow" w:hAnsi="Arial Narrow"/>
+          <w:b/>
+          <w:bCs/>
+        </w:rPr>
+        <w:t>una o varias de las preguntas planteadas anteriormente</w:t>
+      </w:r>
+      <w:r>
+        <w:rPr>
+          <w:rFonts w:ascii="Arial Narrow" w:hAnsi="Arial Narrow" w:cs="Arial"/>
+          <w:bCs/>
+        </w:rPr>
+        <w:t>,</w:t>
+      </w:r>
+      <w:r>
+        <w:rPr>
+          <w:rFonts w:ascii="Arial Narrow" w:hAnsi="Arial Narrow" w:cs="Arial"/>
+          <w:b/>
+          <w:bCs/>
+          <w:i/>
+        </w:rPr>
+        <w:t xml:space="preserve"> </w:t>
+      </w:r>
+      <w:r>
+        <w:rPr>
+          <w:rFonts w:ascii="Arial Narrow" w:hAnsi="Arial Narrow" w:cs="Arial"/>
+          <w:bCs/>
+        </w:rPr>
+        <w:t>y responder de forma negativa a la pregunta</w:t>
+      </w:r>
+      <w:r>
+        <w:rPr>
+          <w:rFonts w:ascii="Arial Narrow" w:hAnsi="Arial Narrow" w:cs="Arial"/>
+          <w:b/>
+          <w:bCs/>
+          <w:i/>
+        </w:rPr>
+        <w:t xml:space="preserve"> </w:t>
+      </w:r>
+      <w:r>
+        <w:rPr>
+          <w:rFonts w:ascii="Arial Narrow" w:hAnsi="Arial Narrow" w:cs="Arial"/>
+          <w:b/>
+          <w:bCs/>
+          <w:i/>
+          <w:iCs/>
+        </w:rPr>
         <w:t>¿Continuará sus estudios bajo la modalidad de ciclos propedéuticos u homologación?</w:t>
       </w:r>
       <w:r>
@@ -1704,9 +1640,9 @@
     </w:p>
     <w:p>
       <w:pPr>
-        <w:rPr>
-          <w:rFonts w:ascii="Arial Narrow" w:hAnsi="Arial Narrow" w:cs="Arial"/>
-          <w:lang w:eastAsia="es-ES"/>
+        <w:jc w:val="both"/>
+        <w:rPr>
+          <w:rFonts w:ascii="Arial Narrow" w:hAnsi="Arial Narrow" w:cs="Arial"/>
         </w:rPr>
       </w:pPr>
     </w:p>
@@ -1725,37 +1661,30 @@
           <w:b/>
           <w:i/>
         </w:rPr>
-        <w:t xml:space="preserve">ARTÍCULO </w:t>
-      </w:r>
-      <w:r>
-        <w:rPr>
-          <w:rFonts w:ascii="Arial Narrow" w:hAnsi="Arial Narrow" w:cs="Arial"/>
-          <w:b/>
+        <w:t>ARTÍCULO QUINTO. INSCRIPCIÓN AL PROGRAMA:</w:t>
+      </w:r>
+      <w:r>
+        <w:rPr>
+          <w:rFonts w:ascii="Arial Narrow" w:hAnsi="Arial Narrow" w:cs="Arial"/>
           <w:i/>
         </w:rPr>
-        <w:t>QUINTO</w:t>
-      </w:r>
-      <w:r>
-        <w:rPr>
-          <w:rFonts w:ascii="Arial Narrow" w:hAnsi="Arial Narrow" w:cs="Arial"/>
-          <w:b/>
+        <w:t xml:space="preserve"> La postulación a la línea de crédito </w:t>
+      </w:r>
+      <w:proofErr w:type="spellStart"/>
+      <w:r>
+        <w:rPr>
+          <w:rFonts w:ascii="Arial Narrow" w:hAnsi="Arial Narrow" w:cs="Arial"/>
           <w:i/>
         </w:rPr>
-        <w:t>. INSCRIPCIÓN AL PROGRAMA:</w:t>
-      </w:r>
+        <w:t>condonable</w:t>
+      </w:r>
+      <w:proofErr w:type="spellEnd"/>
       <w:r>
         <w:rPr>
           <w:rFonts w:ascii="Arial Narrow" w:hAnsi="Arial Narrow" w:cs="Arial"/>
           <w:i/>
         </w:rPr>
-        <w:t xml:space="preserve"> </w:t>
-      </w:r>
-      <w:r>
-        <w:rPr>
-          <w:rFonts w:ascii="Arial Narrow" w:hAnsi="Arial Narrow" w:cs="Arial"/>
-          <w:i/>
-        </w:rPr>
-        <w:t>La postulación a la línea de crédito condonable en pregrado, se debe realizar ingresando al sitio web oficial de la Agencia de Educación Postsecundaria de Medellín – SAPIENCIA, www.sapiencia.gov.co, dentro de las fechas previstas para ello, y teniendo en cuenta lo siguiente:</w:t>
+        <w:t xml:space="preserve"> en pregrado, se debe realizar ingresando al sitio web oficial de la Agencia de Educación Postsecundaria de Medellín – SAPIENCIA, www.sapiencia.gov.co dentro de las fechas previstas para ello, y teniendo en cuenta lo siguiente:</w:t>
       </w:r>
     </w:p>
     <w:p>
@@ -1773,7 +1702,7 @@
         <w:pStyle w:val="Prrafodelista"/>
         <w:numPr>
           <w:ilvl w:val="0"/>
-          <w:numId w:val="18"/>
+          <w:numId w:val="14"/>
         </w:numPr>
         <w:spacing w:line="252" w:lineRule="auto"/>
         <w:jc w:val="both"/>
@@ -1799,7 +1728,7 @@
         <w:pStyle w:val="Prrafodelista"/>
         <w:numPr>
           <w:ilvl w:val="0"/>
-          <w:numId w:val="18"/>
+          <w:numId w:val="14"/>
         </w:numPr>
         <w:spacing w:line="252" w:lineRule="auto"/>
         <w:jc w:val="both"/>
@@ -1829,7 +1758,7 @@
         <w:pStyle w:val="Prrafodelista"/>
         <w:numPr>
           <w:ilvl w:val="0"/>
-          <w:numId w:val="18"/>
+          <w:numId w:val="14"/>
         </w:numPr>
         <w:spacing w:line="252" w:lineRule="auto"/>
         <w:jc w:val="both"/>
@@ -1849,6 +1778,7 @@
           <w:sz w:val="24"/>
           <w:szCs w:val="24"/>
         </w:rPr>
+        <w:lastRenderedPageBreak/>
         <w:t>La información solicitada tiene como finalidad analizar, verificar y evaluar las condiciones de acceso y permanencia para participar en la convocatoria, así como consolidar información para estudios, diagnósticos y valoraciones propias del objeto misional de SAPIENCIA.</w:t>
       </w:r>
     </w:p>
@@ -1857,7 +1787,7 @@
         <w:pStyle w:val="Prrafodelista"/>
         <w:numPr>
           <w:ilvl w:val="0"/>
-          <w:numId w:val="18"/>
+          <w:numId w:val="14"/>
         </w:numPr>
         <w:spacing w:line="252" w:lineRule="auto"/>
         <w:jc w:val="both"/>
@@ -1879,89 +1809,93 @@
           <w:szCs w:val="24"/>
           <w:u w:val="single"/>
         </w:rPr>
-        <w:t xml:space="preserve">Los interesados deberán conocer el reglamento del decreto 032 de 2023, y las demás disposiciones que modifiquen, adicionen o deroguen, que se encuentran en la gaceta oficial </w:t>
-      </w:r>
-      <w:r>
-        <w:rPr>
-          <w:rFonts w:ascii="Arial Narrow" w:hAnsi="Arial Narrow" w:cs="Arial"/>
+        <w:t>Las personas interesadas deberán conocer el Reglamento Operativo del programa contenido en el Decreto 32 de 2023, el Decreto 0344 de 2025 y las demás normas que lo regulen. La inscripción implica la comprensión y aceptación de todas sus condiciones.</w:t>
+      </w:r>
+    </w:p>
+    <w:p>
+      <w:pPr>
+        <w:shd w:val="clear" w:color="auto" w:fill="FFFFFF"/>
+        <w:jc w:val="both"/>
+        <w:rPr>
+          <w:rFonts w:ascii="Arial Narrow" w:hAnsi="Arial Narrow"/>
           <w:b/>
-          <w:i/>
-          <w:sz w:val="24"/>
-          <w:szCs w:val="24"/>
-          <w:u w:val="single"/>
-        </w:rPr>
-        <w:lastRenderedPageBreak/>
-        <w:t>del Distrito o que pueden ser consultadas en www.sapiencia.gov.co. La inscripción al programa significará que entiende y acepta las condiciones del mismo. La inscripción implicará que entiende y acepta las condiciones del mismo.</w:t>
-      </w:r>
-    </w:p>
-    <w:p>
-      <w:pPr>
-        <w:shd w:val="clear" w:color="auto" w:fill="FFFFFF"/>
-        <w:jc w:val="both"/>
+        </w:rPr>
+      </w:pPr>
+      <w:r>
+        <w:rPr>
+          <w:rFonts w:ascii="Arial Narrow" w:hAnsi="Arial Narrow" w:cs="Arial"/>
+          <w:bdr w:val="none" w:sz="0" w:space="0" w:color="auto" w:frame="1"/>
+        </w:rPr>
+        <w:t xml:space="preserve">Así las cosas, la Entidad no puede acceder a lo solicitado, dado que, </w:t>
+      </w:r>
+      <w:r>
+        <w:rPr>
+          <w:rFonts w:ascii="Arial Narrow" w:hAnsi="Arial Narrow" w:cs="Arial"/>
+        </w:rPr>
+        <w:t>la calificación con respecto al caso en concreto, se realizó con base en la información brindada en el formulario de inscripci</w:t>
+      </w:r>
+      <w:r>
+        <w:rPr>
+          <w:rFonts w:ascii="Arial Narrow" w:hAnsi="Arial Narrow" w:cs="Arial"/>
+        </w:rPr>
+        <w:t>ón</w:t>
+      </w:r>
+      <w:r>
+        <w:rPr>
+          <w:rFonts w:ascii="Arial Narrow" w:hAnsi="Arial Narrow" w:cs="Arial"/>
+        </w:rPr>
+        <w:t xml:space="preserve">, de modo que, </w:t>
+      </w:r>
+      <w:r>
+        <w:rPr>
+          <w:rFonts w:ascii="Arial Narrow" w:hAnsi="Arial Narrow" w:cs="Arial"/>
+          <w:bdr w:val="none" w:sz="0" w:space="0" w:color="auto" w:frame="1"/>
+        </w:rPr>
+        <w:t xml:space="preserve">la causa por la que </w:t>
+      </w:r>
+      <w:r>
         <w:rPr>
           <w:rFonts w:ascii="Arial Narrow" w:hAnsi="Arial Narrow"/>
           <w:b/>
         </w:rPr>
-      </w:pPr>
+        <w:t xml:space="preserve">{{Nombre}} </w:t>
+      </w:r>
       <w:r>
         <w:rPr>
           <w:rFonts w:ascii="Arial Narrow" w:hAnsi="Arial Narrow" w:cs="Arial"/>
           <w:bdr w:val="none" w:sz="0" w:space="0" w:color="auto" w:frame="1"/>
         </w:rPr>
-        <w:t xml:space="preserve">Así las cosas, la Entidad no puede acceder a lo solicitado, dado que, </w:t>
-      </w:r>
-      <w:r>
-        <w:rPr>
-          <w:rFonts w:ascii="Arial Narrow" w:hAnsi="Arial Narrow" w:cs="Arial"/>
-        </w:rPr>
-        <w:t>la calificación con respecto al caso en concreto, se realizó con base en la información brindada en el formulario de inscripci</w:t>
-      </w:r>
-      <w:r>
-        <w:rPr>
-          <w:rFonts w:ascii="Arial Narrow" w:hAnsi="Arial Narrow" w:cs="Arial"/>
-        </w:rPr>
-        <w:t>ón</w:t>
-      </w:r>
-      <w:r>
-        <w:rPr>
-          <w:rFonts w:ascii="Arial Narrow" w:hAnsi="Arial Narrow" w:cs="Arial"/>
-        </w:rPr>
-        <w:t xml:space="preserve">, de modo que, </w:t>
+        <w:t>no continuó</w:t>
       </w:r>
       <w:r>
         <w:rPr>
           <w:rFonts w:ascii="Arial Narrow" w:hAnsi="Arial Narrow" w:cs="Arial"/>
           <w:bdr w:val="none" w:sz="0" w:space="0" w:color="auto" w:frame="1"/>
         </w:rPr>
-        <w:t xml:space="preserve">la causa por la que </w:t>
-      </w:r>
-      <w:r>
-        <w:rPr>
-          <w:rFonts w:ascii="Arial Narrow" w:hAnsi="Arial Narrow"/>
-          <w:b/>
-        </w:rPr>
-        <w:t xml:space="preserve">{{Nombre}} </w:t>
+        <w:t xml:space="preserve"> en la convocatoria, se encuentra supeditado a que no cumplió con el requisito habilitante anteriormente mencionado en la presente convocatoria para la línea de crédito de pregrado en las fuente de financiación de </w:t>
       </w:r>
       <w:r>
         <w:rPr>
           <w:rFonts w:ascii="Arial Narrow" w:hAnsi="Arial Narrow" w:cs="Arial"/>
           <w:bdr w:val="none" w:sz="0" w:space="0" w:color="auto" w:frame="1"/>
         </w:rPr>
-        <w:t>no continuó</w:t>
-      </w:r>
+        <w:t>{{</w:t>
+      </w:r>
+      <w:proofErr w:type="spellStart"/>
       <w:r>
         <w:rPr>
           <w:rFonts w:ascii="Arial Narrow" w:hAnsi="Arial Narrow" w:cs="Arial"/>
           <w:bdr w:val="none" w:sz="0" w:space="0" w:color="auto" w:frame="1"/>
         </w:rPr>
-        <w:t xml:space="preserve"> en la convocatoria, se encuentra supeditado a que no cumplió con el requisito habilitante anteriormente mencionado en la presente convocatoria para la línea de crédito de pregrado en las fuente de financiación de </w:t>
-      </w:r>
+        <w:t>fuente_escogida</w:t>
+      </w:r>
+      <w:proofErr w:type="spellEnd"/>
       <w:r>
         <w:rPr>
           <w:rFonts w:ascii="Arial Narrow" w:hAnsi="Arial Narrow" w:cs="Arial"/>
           <w:bdr w:val="none" w:sz="0" w:space="0" w:color="auto" w:frame="1"/>
         </w:rPr>
-        <w:t>{{fuente_escogida}}</w:t>
+        <w:t>}}</w:t>
       </w:r>
       <w:r>
         <w:rPr>
@@ -1991,7 +1925,17 @@
           <w:u w:val="single"/>
           <w:bdr w:val="none" w:sz="0" w:space="0" w:color="auto" w:frame="1"/>
         </w:rPr>
-        <w:t>ostenta el derecho de presentarse en las próximas convocatorias del programa, cumpliendo y guardando absoluta diligencia y cuidado en el diligenciamiento de los requisitos dispuestos en el formulario de inscripción</w:t>
+        <w:t>ostenta el derecho de presentarse en las próximas convocatorias del programa, cumpliendo y guardando absoluta diligencia y cuidado en el diligenciamiento de los requisito</w:t>
+      </w:r>
+      <w:bookmarkStart w:id="0" w:name="_GoBack"/>
+      <w:bookmarkEnd w:id="0"/>
+      <w:r>
+        <w:rPr>
+          <w:rFonts w:ascii="Arial Narrow" w:hAnsi="Arial Narrow" w:cs="Arial"/>
+          <w:u w:val="single"/>
+          <w:bdr w:val="none" w:sz="0" w:space="0" w:color="auto" w:frame="1"/>
+        </w:rPr>
+        <w:t>s dispuestos en el formulario de inscripción</w:t>
       </w:r>
       <w:r>
         <w:rPr>
@@ -2457,7 +2401,7 @@
 </file>
 
 <file path=word/endnotes.xml><?xml version="1.0" encoding="utf-8"?>
-<w:endnotes xmlns:wpc="http://schemas.microsoft.com/office/word/2010/wordprocessingCanvas" xmlns:cx="http://schemas.microsoft.com/office/drawing/2014/chartex" xmlns:cx1="http://schemas.microsoft.com/office/drawing/2015/9/8/chartex" xmlns:cx2="http://schemas.microsoft.com/office/drawing/2015/10/21/chartex" xmlns:cx3="http://schemas.microsoft.com/office/drawing/2016/5/9/chartex" xmlns:cx4="http://schemas.microsoft.com/office/drawing/2016/5/10/chartex" xmlns:cx5="http://schemas.microsoft.com/office/drawing/2016/5/11/chartex" xmlns:cx6="http://schemas.microsoft.com/office/drawing/2016/5/12/chartex" xmlns:cx7="http://schemas.microsoft.com/office/drawing/2016/5/13/chartex" xmlns:cx8="http://schemas.microsoft.com/office/drawing/2016/5/14/chartex" xmlns:mc="http://schemas.openxmlformats.org/markup-compatibility/2006" xmlns:aink="http://schemas.microsoft.com/office/drawing/2016/ink" xmlns:am3d="http://schemas.microsoft.com/office/drawing/2017/model3d" xmlns:o="urn:schemas-microsoft-com:office:office" xmlns:oel="http://schemas.microsoft.com/office/2019/extlst" xmlns:r="http://schemas.openxmlformats.org/officeDocument/2006/relationships" xmlns:m="http://schemas.openxmlformats.org/officeDocument/2006/math" xmlns:v="urn:schemas-microsoft-com:vml" xmlns:wp14="http://schemas.microsoft.com/office/word/2010/wordprocessingDrawing" xmlns:wp="http://schemas.openxmlformats.org/drawingml/2006/wordprocessingDrawing" xmlns:w10="urn:schemas-microsoft-com:office:word" xmlns:w="http://schemas.openxmlformats.org/wordprocessingml/2006/main" xmlns:w14="http://schemas.microsoft.com/office/word/2010/wordml" xmlns:w15="http://schemas.microsoft.com/office/word/2012/wordml" xmlns:w16cex="http://schemas.microsoft.com/office/word/2018/wordml/cex" xmlns:w16cid="http://schemas.microsoft.com/office/word/2016/wordml/cid" xmlns:w16="http://schemas.microsoft.com/office/word/2018/wordml" xmlns:w16du="http://schemas.microsoft.com/office/word/2023/wordml/word16du" xmlns:w16sdtdh="http://schemas.microsoft.com/office/word/2020/wordml/sdtdatahash" xmlns:w16sdtfl="http://schemas.microsoft.com/office/word/2024/wordml/sdtformatlock" xmlns:w16se="http://schemas.microsoft.com/office/word/2015/wordml/symex" xmlns:wpg="http://schemas.microsoft.com/office/word/2010/wordprocessingGroup" xmlns:wpi="http://schemas.microsoft.com/office/word/2010/wordprocessingInk" xmlns:wne="http://schemas.microsoft.com/office/word/2006/wordml" xmlns:wps="http://schemas.microsoft.com/office/word/2010/wordprocessingShape" mc:Ignorable="w14 w15 w16se w16cid w16 w16cex w16sdtdh w16sdtfl w16du wp14">
+<w:endnotes xmlns:wpc="http://schemas.microsoft.com/office/word/2010/wordprocessingCanvas" xmlns:cx="http://schemas.microsoft.com/office/drawing/2014/chartex" xmlns:cx1="http://schemas.microsoft.com/office/drawing/2015/9/8/chartex" xmlns:mc="http://schemas.openxmlformats.org/markup-compatibility/2006" xmlns:o="urn:schemas-microsoft-com:office:office" xmlns:r="http://schemas.openxmlformats.org/officeDocument/2006/relationships" xmlns:m="http://schemas.openxmlformats.org/officeDocument/2006/math" xmlns:v="urn:schemas-microsoft-com:vml" xmlns:wp14="http://schemas.microsoft.com/office/word/2010/wordprocessingDrawing" xmlns:wp="http://schemas.openxmlformats.org/drawingml/2006/wordprocessingDrawing" xmlns:w10="urn:schemas-microsoft-com:office:word" xmlns:w="http://schemas.openxmlformats.org/wordprocessingml/2006/main" xmlns:w14="http://schemas.microsoft.com/office/word/2010/wordml" xmlns:w15="http://schemas.microsoft.com/office/word/2012/wordml" xmlns:w16se="http://schemas.microsoft.com/office/word/2015/wordml/symex" xmlns:wpg="http://schemas.microsoft.com/office/word/2010/wordprocessingGroup" xmlns:wpi="http://schemas.microsoft.com/office/word/2010/wordprocessingInk" xmlns:wne="http://schemas.microsoft.com/office/word/2006/wordml" xmlns:wps="http://schemas.microsoft.com/office/word/2010/wordprocessingShape" mc:Ignorable="w14 w15 w16se wp14">
   <w:endnote w:type="separator" w:id="-1">
     <w:p>
       <w:r>
@@ -2476,7 +2420,7 @@
 </file>
 
 <file path=word/footer1.xml><?xml version="1.0" encoding="utf-8"?>
-<w:ftr xmlns:wpc="http://schemas.microsoft.com/office/word/2010/wordprocessingCanvas" xmlns:cx="http://schemas.microsoft.com/office/drawing/2014/chartex" xmlns:cx1="http://schemas.microsoft.com/office/drawing/2015/9/8/chartex" xmlns:cx2="http://schemas.microsoft.com/office/drawing/2015/10/21/chartex" xmlns:cx3="http://schemas.microsoft.com/office/drawing/2016/5/9/chartex" xmlns:cx4="http://schemas.microsoft.com/office/drawing/2016/5/10/chartex" xmlns:cx5="http://schemas.microsoft.com/office/drawing/2016/5/11/chartex" xmlns:cx6="http://schemas.microsoft.com/office/drawing/2016/5/12/chartex" xmlns:cx7="http://schemas.microsoft.com/office/drawing/2016/5/13/chartex" xmlns:cx8="http://schemas.microsoft.com/office/drawing/2016/5/14/chartex" xmlns:mc="http://schemas.openxmlformats.org/markup-compatibility/2006" xmlns:aink="http://schemas.microsoft.com/office/drawing/2016/ink" xmlns:am3d="http://schemas.microsoft.com/office/drawing/2017/model3d" xmlns:o="urn:schemas-microsoft-com:office:office" xmlns:oel="http://schemas.microsoft.com/office/2019/extlst" xmlns:r="http://schemas.openxmlformats.org/officeDocument/2006/relationships" xmlns:m="http://schemas.openxmlformats.org/officeDocument/2006/math" xmlns:v="urn:schemas-microsoft-com:vml" xmlns:wp14="http://schemas.microsoft.com/office/word/2010/wordprocessingDrawing" xmlns:wp="http://schemas.openxmlformats.org/drawingml/2006/wordprocessingDrawing" xmlns:w10="urn:schemas-microsoft-com:office:word" xmlns:w="http://schemas.openxmlformats.org/wordprocessingml/2006/main" xmlns:w14="http://schemas.microsoft.com/office/word/2010/wordml" xmlns:w15="http://schemas.microsoft.com/office/word/2012/wordml" xmlns:w16cex="http://schemas.microsoft.com/office/word/2018/wordml/cex" xmlns:w16cid="http://schemas.microsoft.com/office/word/2016/wordml/cid" xmlns:w16="http://schemas.microsoft.com/office/word/2018/wordml" xmlns:w16du="http://schemas.microsoft.com/office/word/2023/wordml/word16du" xmlns:w16sdtdh="http://schemas.microsoft.com/office/word/2020/wordml/sdtdatahash" xmlns:w16sdtfl="http://schemas.microsoft.com/office/word/2024/wordml/sdtformatlock" xmlns:w16se="http://schemas.microsoft.com/office/word/2015/wordml/symex" xmlns:wpg="http://schemas.microsoft.com/office/word/2010/wordprocessingGroup" xmlns:wpi="http://schemas.microsoft.com/office/word/2010/wordprocessingInk" xmlns:wne="http://schemas.microsoft.com/office/word/2006/wordml" xmlns:wps="http://schemas.microsoft.com/office/word/2010/wordprocessingShape" mc:Ignorable="w14 w15 w16se w16cid w16 w16cex w16sdtdh w16sdtfl w16du wp14">
+<w:ftr xmlns:wpc="http://schemas.microsoft.com/office/word/2010/wordprocessingCanvas" xmlns:cx="http://schemas.microsoft.com/office/drawing/2014/chartex" xmlns:cx1="http://schemas.microsoft.com/office/drawing/2015/9/8/chartex" xmlns:mc="http://schemas.openxmlformats.org/markup-compatibility/2006" xmlns:o="urn:schemas-microsoft-com:office:office" xmlns:r="http://schemas.openxmlformats.org/officeDocument/2006/relationships" xmlns:m="http://schemas.openxmlformats.org/officeDocument/2006/math" xmlns:v="urn:schemas-microsoft-com:vml" xmlns:wp14="http://schemas.microsoft.com/office/word/2010/wordprocessingDrawing" xmlns:wp="http://schemas.openxmlformats.org/drawingml/2006/wordprocessingDrawing" xmlns:w10="urn:schemas-microsoft-com:office:word" xmlns:w="http://schemas.openxmlformats.org/wordprocessingml/2006/main" xmlns:w14="http://schemas.microsoft.com/office/word/2010/wordml" xmlns:w15="http://schemas.microsoft.com/office/word/2012/wordml" xmlns:w16se="http://schemas.microsoft.com/office/word/2015/wordml/symex" xmlns:wpg="http://schemas.microsoft.com/office/word/2010/wordprocessingGroup" xmlns:wpi="http://schemas.microsoft.com/office/word/2010/wordprocessingInk" xmlns:wne="http://schemas.microsoft.com/office/word/2006/wordml" xmlns:wps="http://schemas.microsoft.com/office/word/2010/wordprocessingShape" mc:Ignorable="w14 w15 w16se wp14">
   <w:p>
     <w:pPr>
       <w:pStyle w:val="Piedepgina"/>
@@ -2529,7 +2473,7 @@
 </file>
 
 <file path=word/footnotes.xml><?xml version="1.0" encoding="utf-8"?>
-<w:footnotes xmlns:wpc="http://schemas.microsoft.com/office/word/2010/wordprocessingCanvas" xmlns:cx="http://schemas.microsoft.com/office/drawing/2014/chartex" xmlns:cx1="http://schemas.microsoft.com/office/drawing/2015/9/8/chartex" xmlns:cx2="http://schemas.microsoft.com/office/drawing/2015/10/21/chartex" xmlns:cx3="http://schemas.microsoft.com/office/drawing/2016/5/9/chartex" xmlns:cx4="http://schemas.microsoft.com/office/drawing/2016/5/10/chartex" xmlns:cx5="http://schemas.microsoft.com/office/drawing/2016/5/11/chartex" xmlns:cx6="http://schemas.microsoft.com/office/drawing/2016/5/12/chartex" xmlns:cx7="http://schemas.microsoft.com/office/drawing/2016/5/13/chartex" xmlns:cx8="http://schemas.microsoft.com/office/drawing/2016/5/14/chartex" xmlns:mc="http://schemas.openxmlformats.org/markup-compatibility/2006" xmlns:aink="http://schemas.microsoft.com/office/drawing/2016/ink" xmlns:am3d="http://schemas.microsoft.com/office/drawing/2017/model3d" xmlns:o="urn:schemas-microsoft-com:office:office" xmlns:oel="http://schemas.microsoft.com/office/2019/extlst" xmlns:r="http://schemas.openxmlformats.org/officeDocument/2006/relationships" xmlns:m="http://schemas.openxmlformats.org/officeDocument/2006/math" xmlns:v="urn:schemas-microsoft-com:vml" xmlns:wp14="http://schemas.microsoft.com/office/word/2010/wordprocessingDrawing" xmlns:wp="http://schemas.openxmlformats.org/drawingml/2006/wordprocessingDrawing" xmlns:w10="urn:schemas-microsoft-com:office:word" xmlns:w="http://schemas.openxmlformats.org/wordprocessingml/2006/main" xmlns:w14="http://schemas.microsoft.com/office/word/2010/wordml" xmlns:w15="http://schemas.microsoft.com/office/word/2012/wordml" xmlns:w16cex="http://schemas.microsoft.com/office/word/2018/wordml/cex" xmlns:w16cid="http://schemas.microsoft.com/office/word/2016/wordml/cid" xmlns:w16="http://schemas.microsoft.com/office/word/2018/wordml" xmlns:w16du="http://schemas.microsoft.com/office/word/2023/wordml/word16du" xmlns:w16sdtdh="http://schemas.microsoft.com/office/word/2020/wordml/sdtdatahash" xmlns:w16sdtfl="http://schemas.microsoft.com/office/word/2024/wordml/sdtformatlock" xmlns:w16se="http://schemas.microsoft.com/office/word/2015/wordml/symex" xmlns:wpg="http://schemas.microsoft.com/office/word/2010/wordprocessingGroup" xmlns:wpi="http://schemas.microsoft.com/office/word/2010/wordprocessingInk" xmlns:wne="http://schemas.microsoft.com/office/word/2006/wordml" xmlns:wps="http://schemas.microsoft.com/office/word/2010/wordprocessingShape" mc:Ignorable="w14 w15 w16se w16cid w16 w16cex w16sdtdh w16sdtfl w16du wp14">
+<w:footnotes xmlns:wpc="http://schemas.microsoft.com/office/word/2010/wordprocessingCanvas" xmlns:cx="http://schemas.microsoft.com/office/drawing/2014/chartex" xmlns:cx1="http://schemas.microsoft.com/office/drawing/2015/9/8/chartex" xmlns:mc="http://schemas.openxmlformats.org/markup-compatibility/2006" xmlns:o="urn:schemas-microsoft-com:office:office" xmlns:r="http://schemas.openxmlformats.org/officeDocument/2006/relationships" xmlns:m="http://schemas.openxmlformats.org/officeDocument/2006/math" xmlns:v="urn:schemas-microsoft-com:vml" xmlns:wp14="http://schemas.microsoft.com/office/word/2010/wordprocessingDrawing" xmlns:wp="http://schemas.openxmlformats.org/drawingml/2006/wordprocessingDrawing" xmlns:w10="urn:schemas-microsoft-com:office:word" xmlns:w="http://schemas.openxmlformats.org/wordprocessingml/2006/main" xmlns:w14="http://schemas.microsoft.com/office/word/2010/wordml" xmlns:w15="http://schemas.microsoft.com/office/word/2012/wordml" xmlns:w16se="http://schemas.microsoft.com/office/word/2015/wordml/symex" xmlns:wpg="http://schemas.microsoft.com/office/word/2010/wordprocessingGroup" xmlns:wpi="http://schemas.microsoft.com/office/word/2010/wordprocessingInk" xmlns:wne="http://schemas.microsoft.com/office/word/2006/wordml" xmlns:wps="http://schemas.microsoft.com/office/word/2010/wordprocessingShape" mc:Ignorable="w14 w15 w16se wp14">
   <w:footnote w:type="separator" w:id="-1">
     <w:p>
       <w:r>
@@ -2548,7 +2492,7 @@
 </file>
 
 <file path=word/header1.xml><?xml version="1.0" encoding="utf-8"?>
-<w:hdr xmlns:wpc="http://schemas.microsoft.com/office/word/2010/wordprocessingCanvas" xmlns:cx="http://schemas.microsoft.com/office/drawing/2014/chartex" xmlns:cx1="http://schemas.microsoft.com/office/drawing/2015/9/8/chartex" xmlns:cx2="http://schemas.microsoft.com/office/drawing/2015/10/21/chartex" xmlns:cx3="http://schemas.microsoft.com/office/drawing/2016/5/9/chartex" xmlns:cx4="http://schemas.microsoft.com/office/drawing/2016/5/10/chartex" xmlns:cx5="http://schemas.microsoft.com/office/drawing/2016/5/11/chartex" xmlns:cx6="http://schemas.microsoft.com/office/drawing/2016/5/12/chartex" xmlns:cx7="http://schemas.microsoft.com/office/drawing/2016/5/13/chartex" xmlns:cx8="http://schemas.microsoft.com/office/drawing/2016/5/14/chartex" xmlns:mc="http://schemas.openxmlformats.org/markup-compatibility/2006" xmlns:aink="http://schemas.microsoft.com/office/drawing/2016/ink" xmlns:am3d="http://schemas.microsoft.com/office/drawing/2017/model3d" xmlns:o="urn:schemas-microsoft-com:office:office" xmlns:oel="http://schemas.microsoft.com/office/2019/extlst" xmlns:r="http://schemas.openxmlformats.org/officeDocument/2006/relationships" xmlns:m="http://schemas.openxmlformats.org/officeDocument/2006/math" xmlns:v="urn:schemas-microsoft-com:vml" xmlns:wp14="http://schemas.microsoft.com/office/word/2010/wordprocessingDrawing" xmlns:wp="http://schemas.openxmlformats.org/drawingml/2006/wordprocessingDrawing" xmlns:w10="urn:schemas-microsoft-com:office:word" xmlns:w="http://schemas.openxmlformats.org/wordprocessingml/2006/main" xmlns:w14="http://schemas.microsoft.com/office/word/2010/wordml" xmlns:w15="http://schemas.microsoft.com/office/word/2012/wordml" xmlns:w16cex="http://schemas.microsoft.com/office/word/2018/wordml/cex" xmlns:w16cid="http://schemas.microsoft.com/office/word/2016/wordml/cid" xmlns:w16="http://schemas.microsoft.com/office/word/2018/wordml" xmlns:w16du="http://schemas.microsoft.com/office/word/2023/wordml/word16du" xmlns:w16sdtdh="http://schemas.microsoft.com/office/word/2020/wordml/sdtdatahash" xmlns:w16sdtfl="http://schemas.microsoft.com/office/word/2024/wordml/sdtformatlock" xmlns:w16se="http://schemas.microsoft.com/office/word/2015/wordml/symex" xmlns:wpg="http://schemas.microsoft.com/office/word/2010/wordprocessingGroup" xmlns:wpi="http://schemas.microsoft.com/office/word/2010/wordprocessingInk" xmlns:wne="http://schemas.microsoft.com/office/word/2006/wordml" xmlns:wps="http://schemas.microsoft.com/office/word/2010/wordprocessingShape" mc:Ignorable="w14 w15 w16se w16cid w16 w16cex w16sdtdh w16sdtfl w16du wp14">
+<w:hdr xmlns:wpc="http://schemas.microsoft.com/office/word/2010/wordprocessingCanvas" xmlns:cx="http://schemas.microsoft.com/office/drawing/2014/chartex" xmlns:cx1="http://schemas.microsoft.com/office/drawing/2015/9/8/chartex" xmlns:mc="http://schemas.openxmlformats.org/markup-compatibility/2006" xmlns:o="urn:schemas-microsoft-com:office:office" xmlns:r="http://schemas.openxmlformats.org/officeDocument/2006/relationships" xmlns:m="http://schemas.openxmlformats.org/officeDocument/2006/math" xmlns:v="urn:schemas-microsoft-com:vml" xmlns:wp14="http://schemas.microsoft.com/office/word/2010/wordprocessingDrawing" xmlns:wp="http://schemas.openxmlformats.org/drawingml/2006/wordprocessingDrawing" xmlns:w10="urn:schemas-microsoft-com:office:word" xmlns:w="http://schemas.openxmlformats.org/wordprocessingml/2006/main" xmlns:w14="http://schemas.microsoft.com/office/word/2010/wordml" xmlns:w15="http://schemas.microsoft.com/office/word/2012/wordml" xmlns:w16se="http://schemas.microsoft.com/office/word/2015/wordml/symex" xmlns:wpg="http://schemas.microsoft.com/office/word/2010/wordprocessingGroup" xmlns:wpi="http://schemas.microsoft.com/office/word/2010/wordprocessingInk" xmlns:wne="http://schemas.microsoft.com/office/word/2006/wordml" xmlns:wps="http://schemas.microsoft.com/office/word/2010/wordprocessingShape" mc:Ignorable="w14 w15 w16se wp14">
   <w:p>
     <w:pPr>
       <w:pStyle w:val="Encabezado"/>
@@ -2615,7 +2559,7 @@
 </file>
 
 <file path=word/numbering.xml><?xml version="1.0" encoding="utf-8"?>
-<w:numbering xmlns:wpc="http://schemas.microsoft.com/office/word/2010/wordprocessingCanvas" xmlns:cx="http://schemas.microsoft.com/office/drawing/2014/chartex" xmlns:cx1="http://schemas.microsoft.com/office/drawing/2015/9/8/chartex" xmlns:cx2="http://schemas.microsoft.com/office/drawing/2015/10/21/chartex" xmlns:cx3="http://schemas.microsoft.com/office/drawing/2016/5/9/chartex" xmlns:cx4="http://schemas.microsoft.com/office/drawing/2016/5/10/chartex" xmlns:cx5="http://schemas.microsoft.com/office/drawing/2016/5/11/chartex" xmlns:cx6="http://schemas.microsoft.com/office/drawing/2016/5/12/chartex" xmlns:cx7="http://schemas.microsoft.com/office/drawing/2016/5/13/chartex" xmlns:cx8="http://schemas.microsoft.com/office/drawing/2016/5/14/chartex" xmlns:mc="http://schemas.openxmlformats.org/markup-compatibility/2006" xmlns:aink="http://schemas.microsoft.com/office/drawing/2016/ink" xmlns:am3d="http://schemas.microsoft.com/office/drawing/2017/model3d" xmlns:o="urn:schemas-microsoft-com:office:office" xmlns:oel="http://schemas.microsoft.com/office/2019/extlst" xmlns:r="http://schemas.openxmlformats.org/officeDocument/2006/relationships" xmlns:m="http://schemas.openxmlformats.org/officeDocument/2006/math" xmlns:v="urn:schemas-microsoft-com:vml" xmlns:wp14="http://schemas.microsoft.com/office/word/2010/wordprocessingDrawing" xmlns:wp="http://schemas.openxmlformats.org/drawingml/2006/wordprocessingDrawing" xmlns:w10="urn:schemas-microsoft-com:office:word" xmlns:w="http://schemas.openxmlformats.org/wordprocessingml/2006/main" xmlns:w14="http://schemas.microsoft.com/office/word/2010/wordml" xmlns:w15="http://schemas.microsoft.com/office/word/2012/wordml" xmlns:w16cex="http://schemas.microsoft.com/office/word/2018/wordml/cex" xmlns:w16cid="http://schemas.microsoft.com/office/word/2016/wordml/cid" xmlns:w16="http://schemas.microsoft.com/office/word/2018/wordml" xmlns:w16du="http://schemas.microsoft.com/office/word/2023/wordml/word16du" xmlns:w16sdtdh="http://schemas.microsoft.com/office/word/2020/wordml/sdtdatahash" xmlns:w16sdtfl="http://schemas.microsoft.com/office/word/2024/wordml/sdtformatlock" xmlns:w16se="http://schemas.microsoft.com/office/word/2015/wordml/symex" xmlns:wpg="http://schemas.microsoft.com/office/word/2010/wordprocessingGroup" xmlns:wpi="http://schemas.microsoft.com/office/word/2010/wordprocessingInk" xmlns:wne="http://schemas.microsoft.com/office/word/2006/wordml" xmlns:wps="http://schemas.microsoft.com/office/word/2010/wordprocessingShape" mc:Ignorable="w14 w15 w16se w16cid w16 w16cex w16sdtdh w16sdtfl w16du wp14">
+<w:numbering xmlns:wpc="http://schemas.microsoft.com/office/word/2010/wordprocessingCanvas" xmlns:cx="http://schemas.microsoft.com/office/drawing/2014/chartex" xmlns:cx1="http://schemas.microsoft.com/office/drawing/2015/9/8/chartex" xmlns:mc="http://schemas.openxmlformats.org/markup-compatibility/2006" xmlns:o="urn:schemas-microsoft-com:office:office" xmlns:r="http://schemas.openxmlformats.org/officeDocument/2006/relationships" xmlns:m="http://schemas.openxmlformats.org/officeDocument/2006/math" xmlns:v="urn:schemas-microsoft-com:vml" xmlns:wp14="http://schemas.microsoft.com/office/word/2010/wordprocessingDrawing" xmlns:wp="http://schemas.openxmlformats.org/drawingml/2006/wordprocessingDrawing" xmlns:w10="urn:schemas-microsoft-com:office:word" xmlns:w="http://schemas.openxmlformats.org/wordprocessingml/2006/main" xmlns:w14="http://schemas.microsoft.com/office/word/2010/wordml" xmlns:w15="http://schemas.microsoft.com/office/word/2012/wordml" xmlns:w16se="http://schemas.microsoft.com/office/word/2015/wordml/symex" xmlns:wpg="http://schemas.microsoft.com/office/word/2010/wordprocessingGroup" xmlns:wpi="http://schemas.microsoft.com/office/word/2010/wordprocessingInk" xmlns:wne="http://schemas.microsoft.com/office/word/2006/wordml" xmlns:wps="http://schemas.microsoft.com/office/word/2010/wordprocessingShape" mc:Ignorable="w14 w15 w16se wp14">
   <w:abstractNum w:abstractNumId="0" w15:restartNumberingAfterBreak="0">
     <w:nsid w:val="05FF4235"/>
     <w:multiLevelType w:val="hybridMultilevel"/>
@@ -4389,28 +4333,28 @@
       </w:rPr>
     </w:lvl>
   </w:abstractNum>
-  <w:num w:numId="1" w16cid:durableId="1601722391">
+  <w:num w:numId="1">
     <w:abstractNumId w:val="0"/>
   </w:num>
-  <w:num w:numId="2" w16cid:durableId="72899387">
+  <w:num w:numId="2">
     <w:abstractNumId w:val="9"/>
   </w:num>
-  <w:num w:numId="3" w16cid:durableId="945968651">
+  <w:num w:numId="3">
     <w:abstractNumId w:val="6"/>
   </w:num>
-  <w:num w:numId="4" w16cid:durableId="40399703">
+  <w:num w:numId="4">
     <w:abstractNumId w:val="7"/>
   </w:num>
-  <w:num w:numId="5" w16cid:durableId="661468578">
+  <w:num w:numId="5">
     <w:abstractNumId w:val="11"/>
   </w:num>
-  <w:num w:numId="6" w16cid:durableId="115412732">
+  <w:num w:numId="6">
     <w:abstractNumId w:val="1"/>
   </w:num>
-  <w:num w:numId="7" w16cid:durableId="1815944764">
+  <w:num w:numId="7">
     <w:abstractNumId w:val="5"/>
   </w:num>
-  <w:num w:numId="8" w16cid:durableId="342560242">
+  <w:num w:numId="8">
     <w:abstractNumId w:val="4"/>
     <w:lvlOverride w:ilvl="0">
       <w:startOverride w:val="1"/>
@@ -4440,7 +4384,7 @@
       <w:startOverride w:val="1"/>
     </w:lvlOverride>
   </w:num>
-  <w:num w:numId="9" w16cid:durableId="522322260">
+  <w:num w:numId="9">
     <w:abstractNumId w:val="8"/>
     <w:lvlOverride w:ilvl="0">
       <w:startOverride w:val="1"/>
@@ -4470,28 +4414,28 @@
       <w:startOverride w:val="1"/>
     </w:lvlOverride>
   </w:num>
-  <w:num w:numId="10" w16cid:durableId="443423964">
+  <w:num w:numId="10">
     <w:abstractNumId w:val="14"/>
   </w:num>
-  <w:num w:numId="11" w16cid:durableId="666174865">
+  <w:num w:numId="11">
     <w:abstractNumId w:val="15"/>
   </w:num>
-  <w:num w:numId="12" w16cid:durableId="507720873">
+  <w:num w:numId="12">
     <w:abstractNumId w:val="16"/>
   </w:num>
-  <w:num w:numId="13" w16cid:durableId="1574968562">
+  <w:num w:numId="13">
     <w:abstractNumId w:val="2"/>
   </w:num>
-  <w:num w:numId="14" w16cid:durableId="1900629928">
+  <w:num w:numId="14">
     <w:abstractNumId w:val="10"/>
   </w:num>
-  <w:num w:numId="15" w16cid:durableId="1118333129">
+  <w:num w:numId="15">
     <w:abstractNumId w:val="12"/>
   </w:num>
-  <w:num w:numId="16" w16cid:durableId="911895173">
+  <w:num w:numId="16">
     <w:abstractNumId w:val="10"/>
   </w:num>
-  <w:num w:numId="17" w16cid:durableId="2000308191">
+  <w:num w:numId="17">
     <w:abstractNumId w:val="13"/>
     <w:lvlOverride w:ilvl="0">
       <w:startOverride w:val="1"/>
@@ -4521,17 +4465,17 @@
       <w:startOverride w:val="1"/>
     </w:lvlOverride>
   </w:num>
-  <w:num w:numId="18" w16cid:durableId="1242593966">
+  <w:num w:numId="18">
     <w:abstractNumId w:val="10"/>
   </w:num>
-  <w:num w:numId="19" w16cid:durableId="1357385758">
+  <w:num w:numId="19">
     <w:abstractNumId w:val="3"/>
   </w:num>
 </w:numbering>
 </file>
 
 <file path=word/styles.xml><?xml version="1.0" encoding="utf-8"?>
-<w:styles xmlns:mc="http://schemas.openxmlformats.org/markup-compatibility/2006" xmlns:r="http://schemas.openxmlformats.org/officeDocument/2006/relationships" xmlns:w="http://schemas.openxmlformats.org/wordprocessingml/2006/main" xmlns:w14="http://schemas.microsoft.com/office/word/2010/wordml" xmlns:w15="http://schemas.microsoft.com/office/word/2012/wordml" xmlns:w16cex="http://schemas.microsoft.com/office/word/2018/wordml/cex" xmlns:w16cid="http://schemas.microsoft.com/office/word/2016/wordml/cid" xmlns:w16="http://schemas.microsoft.com/office/word/2018/wordml" xmlns:w16du="http://schemas.microsoft.com/office/word/2023/wordml/word16du" xmlns:w16sdtdh="http://schemas.microsoft.com/office/word/2020/wordml/sdtdatahash" xmlns:w16sdtfl="http://schemas.microsoft.com/office/word/2024/wordml/sdtformatlock" xmlns:w16se="http://schemas.microsoft.com/office/word/2015/wordml/symex" mc:Ignorable="w14 w15 w16se w16cid w16 w16cex w16sdtdh w16sdtfl w16du">
+<w:styles xmlns:mc="http://schemas.openxmlformats.org/markup-compatibility/2006" xmlns:r="http://schemas.openxmlformats.org/officeDocument/2006/relationships" xmlns:w="http://schemas.openxmlformats.org/wordprocessingml/2006/main" xmlns:w14="http://schemas.microsoft.com/office/word/2010/wordml" xmlns:w15="http://schemas.microsoft.com/office/word/2012/wordml" xmlns:w16se="http://schemas.microsoft.com/office/word/2015/wordml/symex" mc:Ignorable="w14 w15 w16se">
   <w:docDefaults>
     <w:rPrDefault>
       <w:rPr>
@@ -4545,7 +4489,7 @@
     </w:rPrDefault>
     <w:pPrDefault/>
   </w:docDefaults>
-  <w:latentStyles w:defLockedState="0" w:defUIPriority="99" w:defSemiHidden="0" w:defUnhideWhenUsed="0" w:defQFormat="0" w:count="376">
+  <w:latentStyles w:defLockedState="0" w:defUIPriority="99" w:defSemiHidden="0" w:defUnhideWhenUsed="0" w:defQFormat="0" w:count="371">
     <w:lsdException w:name="Normal" w:uiPriority="0" w:qFormat="1"/>
     <w:lsdException w:name="heading 1" w:uiPriority="9" w:qFormat="1"/>
     <w:lsdException w:name="heading 2" w:semiHidden="1" w:uiPriority="9" w:unhideWhenUsed="1" w:qFormat="1"/>
@@ -4917,11 +4861,6 @@
     <w:lsdException w:name="List Table 5 Dark Accent 6" w:uiPriority="50"/>
     <w:lsdException w:name="List Table 6 Colorful Accent 6" w:uiPriority="51"/>
     <w:lsdException w:name="List Table 7 Colorful Accent 6" w:uiPriority="52"/>
-    <w:lsdException w:name="Mention" w:semiHidden="1" w:unhideWhenUsed="1"/>
-    <w:lsdException w:name="Smart Hyperlink" w:semiHidden="1" w:unhideWhenUsed="1"/>
-    <w:lsdException w:name="Hashtag" w:semiHidden="1" w:unhideWhenUsed="1"/>
-    <w:lsdException w:name="Unresolved Mention" w:semiHidden="1" w:unhideWhenUsed="1"/>
-    <w:lsdException w:name="Smart Link" w:semiHidden="1" w:unhideWhenUsed="1"/>
   </w:latentStyles>
   <w:style w:type="paragraph" w:default="1" w:styleId="Normal">
     <w:name w:val="Normal"/>
@@ -5445,6 +5384,15 @@
 </file>
 
 <file path=customXml/item1.xml><?xml version="1.0" encoding="utf-8"?>
+<?mso-contentType ?>
+<FormTemplates xmlns="http://schemas.microsoft.com/sharepoint/v3/contenttype/forms">
+  <Display>DocumentLibraryForm</Display>
+  <Edit>DocumentLibraryForm</Edit>
+  <New>DocumentLibraryForm</New>
+</FormTemplates>
+</file>
+
+<file path=customXml/item2.xml><?xml version="1.0" encoding="utf-8"?>
 <ct:contentTypeSchema xmlns:ct="http://schemas.microsoft.com/office/2006/metadata/contentType" xmlns:ma="http://schemas.microsoft.com/office/2006/metadata/properties/metaAttributes" ct:_="" ma:_="" ma:contentTypeName="Documento" ma:contentTypeID="0x010100D9CCCA44E2C99944BAE64B502DE3FD2A" ma:contentTypeVersion="14" ma:contentTypeDescription="Crear nuevo documento." ma:contentTypeScope="" ma:versionID="541d41fcd197c0a462c12f5c2f31ff2c">
   <xsd:schema xmlns:xsd="http://www.w3.org/2001/XMLSchema" xmlns:xs="http://www.w3.org/2001/XMLSchema" xmlns:p="http://schemas.microsoft.com/office/2006/metadata/properties" xmlns:ns2="b3f023d8-5d21-4a64-81dc-e4e2f442a49c" xmlns:ns3="89c07dc6-a914-4a48-b388-dfe830e5bbb3" targetNamespace="http://schemas.microsoft.com/office/2006/metadata/properties" ma:root="true" ma:fieldsID="a98b3da299219d0f4bb583511f000a27" ns2:_="" ns3:_="">
     <xsd:import namespace="b3f023d8-5d21-4a64-81dc-e4e2f442a49c"/>
@@ -5673,7 +5621,7 @@
 </ct:contentTypeSchema>
 </file>
 
-<file path=customXml/item2.xml><?xml version="1.0" encoding="utf-8"?>
+<file path=customXml/item3.xml><?xml version="1.0" encoding="utf-8"?>
 <p:properties xmlns:p="http://schemas.microsoft.com/office/2006/metadata/properties" xmlns:xsi="http://www.w3.org/2001/XMLSchema-instance" xmlns:pc="http://schemas.microsoft.com/office/infopath/2007/PartnerControls">
   <documentManagement>
     <TaxCatchAll xmlns="89c07dc6-a914-4a48-b388-dfe830e5bbb3" xsi:nil="true"/>
@@ -5684,20 +5632,19 @@
 </p:properties>
 </file>
 
-<file path=customXml/item3.xml><?xml version="1.0" encoding="utf-8"?>
+<file path=customXml/item4.xml><?xml version="1.0" encoding="utf-8"?>
 <b:Sources xmlns:b="http://schemas.openxmlformats.org/officeDocument/2006/bibliography" xmlns="http://schemas.openxmlformats.org/officeDocument/2006/bibliography" SelectedStyle="\APASixthEditionOfficeOnline.xsl" StyleName="APA" Version="6"/>
 </file>
 
-<file path=customXml/item4.xml><?xml version="1.0" encoding="utf-8"?>
-<?mso-contentType ?>
-<FormTemplates xmlns="http://schemas.microsoft.com/sharepoint/v3/contenttype/forms">
-  <Display>DocumentLibraryForm</Display>
-  <Edit>DocumentLibraryForm</Edit>
-  <New>DocumentLibraryForm</New>
-</FormTemplates>
+<file path=customXml/itemProps1.xml><?xml version="1.0" encoding="utf-8"?>
+<ds:datastoreItem xmlns:ds="http://schemas.openxmlformats.org/officeDocument/2006/customXml" ds:itemID="{B5303028-1E1D-4329-8F7C-A4173A0F993A}">
+  <ds:schemaRefs>
+    <ds:schemaRef ds:uri="http://schemas.microsoft.com/sharepoint/v3/contenttype/forms"/>
+  </ds:schemaRefs>
+</ds:datastoreItem>
 </file>
 
-<file path=customXml/itemProps1.xml><?xml version="1.0" encoding="utf-8"?>
+<file path=customXml/itemProps2.xml><?xml version="1.0" encoding="utf-8"?>
 <ds:datastoreItem xmlns:ds="http://schemas.openxmlformats.org/officeDocument/2006/customXml" ds:itemID="{3F2C3356-243B-4E64-98E4-CD3EAEDDE24C}">
   <ds:schemaRefs>
     <ds:schemaRef ds:uri="http://schemas.microsoft.com/office/2006/metadata/contentType"/>
@@ -5716,7 +5663,7 @@
 </ds:datastoreItem>
 </file>
 
-<file path=customXml/itemProps2.xml><?xml version="1.0" encoding="utf-8"?>
+<file path=customXml/itemProps3.xml><?xml version="1.0" encoding="utf-8"?>
 <ds:datastoreItem xmlns:ds="http://schemas.openxmlformats.org/officeDocument/2006/customXml" ds:itemID="{AAD997A6-A5A0-4F9D-9D70-683CECCE6EDD}">
   <ds:schemaRefs>
     <ds:schemaRef ds:uri="http://schemas.microsoft.com/office/2006/metadata/properties"/>
@@ -5727,18 +5674,10 @@
 </ds:datastoreItem>
 </file>
 
-<file path=customXml/itemProps3.xml><?xml version="1.0" encoding="utf-8"?>
-<ds:datastoreItem xmlns:ds="http://schemas.openxmlformats.org/officeDocument/2006/customXml" ds:itemID="{FF763E41-D5FE-4F3F-AA79-438AE1A918DF}">
+<file path=customXml/itemProps4.xml><?xml version="1.0" encoding="utf-8"?>
+<ds:datastoreItem xmlns:ds="http://schemas.openxmlformats.org/officeDocument/2006/customXml" ds:itemID="{38FA8341-F48A-41E7-8876-71AC5AEDD086}">
   <ds:schemaRefs>
     <ds:schemaRef ds:uri="http://schemas.openxmlformats.org/officeDocument/2006/bibliography"/>
   </ds:schemaRefs>
 </ds:datastoreItem>
-</file>
-
-<file path=customXml/itemProps4.xml><?xml version="1.0" encoding="utf-8"?>
-<ds:datastoreItem xmlns:ds="http://schemas.openxmlformats.org/officeDocument/2006/customXml" ds:itemID="{B5303028-1E1D-4329-8F7C-A4173A0F993A}">
-  <ds:schemaRefs>
-    <ds:schemaRef ds:uri="http://schemas.microsoft.com/sharepoint/v3/contenttype/forms"/>
-  </ds:schemaRefs>
-</ds:datastoreItem>
 </file>
</xml_diff>